<commit_message>
Put signed consortium work splits into the contracting agreement.
The recruiter contract named the three members but not Article 4
duties. Add those splits to clause 10.12, align clause 1.3 with actual
mining and blasting, and keep joint liability to the recruiter.

Co-authored-by: Jett Wang <jamiesun@users.noreply.github.com>
</commit_message>
<xml_diff>
--- a/deliverables/desheng-clause-redline.docx
+++ b/deliverables/desheng-clause-redline.docx
@@ -103,7 +103,7 @@
           <w:sz w:val="24"/>
           <w:szCs w:val="24"/>
         </w:rPr>
-        <w:t xml:space="preserve">：从承包人（中选联合体）整体利益出发，只改重大利益和核心条款。每条均列条文序号、原文、风险点和修改后条文。乙方作为承包方一体享有权利、承担义务，不拆分乙方一、乙方二、乙方三。防挂靠、用工、对内追偿不订入本合同。</w:t>
+        <w:t xml:space="preserve">：从承包人（中选联合体）整体利益出发，只改重大利益和核心条款。对甲方仍为一体连带。已签订《联合体协议书》第四条的成员分工未写入本合同的，应订入第10.12条，并与第1.3条实际实施对齐。防挂靠的对内费用、追偿仍放在《联合体内部合作协议》，不把资质费订入承包合同。</w:t>
       </w:r>
     </w:p>
     <w:p>
@@ -135,7 +135,7 @@
           <w:sz w:val="24"/>
           <w:szCs w:val="24"/>
         </w:rPr>
-        <w:t xml:space="preserve">：仅作参考，不提修改意见。</w:t>
+        <w:t xml:space="preserve">：已盖章，不提修改意见。其第四条分工作为承包合同第10.12条的订入依据。</w:t>
       </w:r>
     </w:p>
     <w:p>
@@ -167,7 +167,7 @@
           <w:sz w:val="24"/>
           <w:szCs w:val="24"/>
         </w:rPr>
-        <w:t xml:space="preserve">：从德晟角度，先指出总体违法，再按条文修改。甲乙双方对应牵头方与德晟。</w:t>
+        <w:t xml:space="preserve">：从德晟角度，先指出总体违法，再按条文修改。对内安排不得与已签订《联合体协议书》第四条、承包合同第10.12条相悖。</w:t>
       </w:r>
     </w:p>
     <w:p>
@@ -739,7 +739,7 @@
           <w:sz w:val="28"/>
           <w:szCs w:val="28"/>
         </w:rPr>
-        <w:t xml:space="preserve">第2.6条</w:t>
+        <w:t xml:space="preserve">第1.3条</w:t>
       </w:r>
     </w:p>
     <w:p>
@@ -783,7 +783,7 @@
           <w:sz w:val="24"/>
           <w:szCs w:val="24"/>
         </w:rPr>
-        <w:t xml:space="preserve">第2.6条　乙方全面负责黄长矿区建筑用板岩矿的基础建设、配套设施建设、村级道路拓宽、设备投入、采掘运输、生产经营、销售管理及物流调度等开发运营全链条工作；具体承担因乙方原因导致的安全环保措施落实、生态修复工程实施、属地矛盾纠纷协调处理等日常管理事务；对矿山开发运营过程中的生产安全、产品质量（与地勘资料原矿分析数据不符的除外）、成本控制及经营风险负全面责任，并承担由此产生的全部费用、损失及法律责任；享有矿山开发经营所得收益，收益分配方式按本协议相关约定执行。因历史遗留问题导致的征地拆迁和权属争议有关的属地矛盾纠纷由甲方负责，因日常建设和生产引发的纠纷由乙方负责处理。</w:t>
+        <w:t xml:space="preserve">第1.3条　乙方的矿山采掘作业工程队应具备矿山工程施工总承包壹级及以上资质，且须具备采掘安全许可及公安部门颁发的爆破作业许可证；并在人员、设备、资金等方面具有相应的施工能力。</w:t>
       </w:r>
     </w:p>
     <w:p>
@@ -827,7 +827,7 @@
           <w:sz w:val="24"/>
           <w:szCs w:val="24"/>
         </w:rPr>
-        <w:t xml:space="preserve">「全部法律责任」与第2.5条、第9.3条冲突。《最高人民法院关于审理矿业权纠纷案件适用法律若干问题的解释》第12条第2款：约定矿业权人仅收取承包费、放弃矿山管理、不承担安全与生态修复法律责任的，合同无效。合同无效则乙方已投入、已付承包费、预付款、保证金均难以按有效合同保护。</w:t>
+        <w:t xml:space="preserve">原文把壹级资质和爆破许可写在「乙方的工程队」名下，未对应已签订《联合体协议书》第四条的成员分工，也未要求实际实施。与第10.12条仅列名称、不列分工叠加后，对外仍像三家一体履约，对内却可能变成仅持证不实施。</w:t>
       </w:r>
     </w:p>
     <w:p>
@@ -888,7 +888,7 @@
           <w:sz w:val="24"/>
           <w:szCs w:val="24"/>
         </w:rPr>
-        <w:t xml:space="preserve">第2.6条</w:t>
+        <w:t xml:space="preserve">第1.3条</w:t>
       </w:r>
     </w:p>
     <w:p>
@@ -903,7 +903,7 @@
           <w:sz w:val="24"/>
           <w:szCs w:val="24"/>
         </w:rPr>
-        <w:t xml:space="preserve">乙方负责基础建设、配套设施、村级道路拓宽、设备投入、采掘运输、生产经营、销售及物流等开发运营工作，承担因乙方原因导致的安全环保措施落实、生态修复现场实施、日常建设生产引发的纠纷处理，并承担本合同约定的费用和经营风险。甲方的安全环保管理、生态修复治理及历史遗留征拆权属争议，按第2.5条、第4.1条、第9.3条执行。乙方承担现场实施和约定费用，不替代甲方的法定主体责任。</w:t>
+        <w:t xml:space="preserve">乙方一、乙方二、乙方三按第10.12条分工实际实施。矿山采掘（剥）、剥离及转运作业由具备矿山工程施工总承包壹级及以上资质的乙方二实际实施；爆破作业由持有公安部门颁发的爆破作业许可证的乙方三实际实施。前述单位须在人员、设备、资金等方面具有相应施工能力，不得仅提供资质证书或许可证而不实施。</w:t>
       </w:r>
     </w:p>
     <w:p>
@@ -958,7 +958,7 @@
           <w:sz w:val="28"/>
           <w:szCs w:val="28"/>
         </w:rPr>
-        <w:t xml:space="preserve">第4.2条第（2）项</w:t>
+        <w:t xml:space="preserve">第2.6条</w:t>
       </w:r>
     </w:p>
     <w:p>
@@ -1002,7 +1002,7 @@
           <w:sz w:val="24"/>
           <w:szCs w:val="24"/>
         </w:rPr>
-        <w:t xml:space="preserve">第4.2条第（2）项　全面负责矿山开采、石料加工、产品销售管理及物流运输等开发运营全流程工作，对开采加工质量、产品输出、物流调配等生产经营环节实施全链条管理，对生产、运营过程中发生的一切安全事故承担责任，并负责赔偿由此造成的人身伤亡、财产损失及其他一切损失。因乙方管理不善或操作不当导致甲方受到任何关联追责的，乙方应承担全部赔偿责任。</w:t>
+        <w:t xml:space="preserve">第2.6条　乙方全面负责黄长矿区建筑用板岩矿的基础建设、配套设施建设、村级道路拓宽、设备投入、采掘运输、生产经营、销售管理及物流调度等开发运营全链条工作；具体承担因乙方原因导致的安全环保措施落实、生态修复工程实施、属地矛盾纠纷协调处理等日常管理事务；对矿山开发运营过程中的生产安全、产品质量（与地勘资料原矿分析数据不符的除外）、成本控制及经营风险负全面责任，并承担由此产生的全部费用、损失及法律责任；享有矿山开发经营所得收益，收益分配方式按本协议相关约定执行。因历史遗留问题导致的征地拆迁和权属争议有关的属地矛盾纠纷由甲方负责，因日常建设和生产引发的纠纷由乙方负责处理。</w:t>
       </w:r>
     </w:p>
     <w:p>
@@ -1046,7 +1046,7 @@
           <w:sz w:val="24"/>
           <w:szCs w:val="24"/>
         </w:rPr>
-        <w:t xml:space="preserve">「一切安全事故」把法定主体责任推给乙方，与第9.3条冲突，有合同效力风险。</w:t>
+        <w:t xml:space="preserve">「全部法律责任」与第2.5条、第9.3条冲突。《最高人民法院关于审理矿业权纠纷案件适用法律若干问题的解释》第12条第2款：约定矿业权人仅收取承包费、放弃矿山管理、不承担安全与生态修复法律责任的，合同无效。合同无效则乙方已投入、已付承包费、预付款、保证金均难以按有效合同保护。</w:t>
       </w:r>
     </w:p>
     <w:p>
@@ -1107,7 +1107,7 @@
           <w:sz w:val="24"/>
           <w:szCs w:val="24"/>
         </w:rPr>
-        <w:t xml:space="preserve">第4.2条第（2）项</w:t>
+        <w:t xml:space="preserve">第2.6条</w:t>
       </w:r>
     </w:p>
     <w:p>
@@ -1122,7 +1122,7 @@
           <w:sz w:val="24"/>
           <w:szCs w:val="24"/>
         </w:rPr>
-        <w:t xml:space="preserve">乙方负责开采、加工、销售及物流的现场实施。因乙方原因发生的生产安全事故、产品质量问题，乙方承担相应责任。甲方的安全环保主体责任按第9.3条执行。因甲方未履行第4.1条、第9.3条导致的追责，由甲方承担。</w:t>
+        <w:t xml:space="preserve">乙方负责基础建设、配套设施、村级道路拓宽、设备投入、采掘运输、生产经营、销售及物流等开发运营工作，具体实施按第10.12条分工执行。承担因乙方原因导致的安全环保措施落实、生态修复现场实施、日常建设生产引发的纠纷处理，并承担本合同约定的费用和经营风险。甲方的安全环保管理、生态修复治理及历史遗留征拆权属争议，按第2.5条、第4.1条、第9.3条执行。乙方承担现场实施和约定费用，不替代甲方的法定主体责任。</w:t>
       </w:r>
     </w:p>
     <w:p>
@@ -1177,7 +1177,7 @@
           <w:sz w:val="28"/>
           <w:szCs w:val="28"/>
         </w:rPr>
-        <w:t xml:space="preserve">第4.2条第（5）项</w:t>
+        <w:t xml:space="preserve">第4.2条第（2）项</w:t>
       </w:r>
     </w:p>
     <w:p>
@@ -1221,7 +1221,7 @@
           <w:sz w:val="24"/>
           <w:szCs w:val="24"/>
         </w:rPr>
-        <w:t xml:space="preserve">第4.2条第（5）项　乙方负责具体实施与落实安全环保管理、生态修复治理及属地矛盾纠纷协调等职责，包括但不限于编制并执行安全环保方案、开展日常隐患排查与治理、实施土地复垦及植被恢复、负责与矿区周边村组及居民进行沟通协调并处理相关纠纷等。履行上述职责所产生的全部费用（包括但不限于矿山开采过程中的行政规费、第三方服务费、补偿款、协调支出及其他相关开支）均由乙方承担。因乙方未按约定履行上述职责，导致甲方被行政处罚、被追究法律责任或遭受其他损失的，乙方应赔偿甲方全部损失。</w:t>
+        <w:t xml:space="preserve">第4.2条第（2）项　全面负责矿山开采、石料加工、产品销售管理及物流运输等开发运营全流程工作，对开采加工质量、产品输出、物流调配等生产经营环节实施全链条管理，对生产、运营过程中发生的一切安全事故承担责任，并负责赔偿由此造成的人身伤亡、财产损失及其他一切损失。因乙方管理不善或操作不当导致甲方受到任何关联追责的，乙方应承担全部赔偿责任。</w:t>
       </w:r>
     </w:p>
     <w:p>
@@ -1265,7 +1265,7 @@
           <w:sz w:val="24"/>
           <w:szCs w:val="24"/>
         </w:rPr>
-        <w:t xml:space="preserve">承包费、村补、生态修复金已有标准。本项再开「全部费用」，等于在付承包费之外无限加码，直接吃掉第7.2条「剩余经营收入归乙方」。</w:t>
+        <w:t xml:space="preserve">「一切安全事故」把法定主体责任推给乙方，与第9.3条冲突，有合同效力风险。</w:t>
       </w:r>
     </w:p>
     <w:p>
@@ -1326,7 +1326,7 @@
           <w:sz w:val="24"/>
           <w:szCs w:val="24"/>
         </w:rPr>
-        <w:t xml:space="preserve">第4.2条第（5）项</w:t>
+        <w:t xml:space="preserve">第4.2条第（2）项</w:t>
       </w:r>
     </w:p>
     <w:p>
@@ -1341,7 +1341,7 @@
           <w:sz w:val="24"/>
           <w:szCs w:val="24"/>
         </w:rPr>
-        <w:t xml:space="preserve">乙方负责安全环保、生态修复及日常村组协调的现场实施。应由矿权人缴纳的行政规费、手续费按第2.5条由甲方承担。村级款项按第4.2条第（6）项执行。第（6）项以外、单笔超过10万元或当年累计超过50万元的协调补偿，须双方书面确认后方由乙方承担。因甲方未履行法定主体责任被处罚的，由甲方承担。</w:t>
+        <w:t xml:space="preserve">乙方负责开采、加工、销售及物流的现场实施。因乙方原因发生的生产安全事故、产品质量问题，乙方承担相应责任。甲方的安全环保主体责任按第9.3条执行。因甲方未履行第4.1条、第9.3条导致的追责，由甲方承担。</w:t>
       </w:r>
     </w:p>
     <w:p>
@@ -1396,7 +1396,7 @@
           <w:sz w:val="28"/>
           <w:szCs w:val="28"/>
         </w:rPr>
-        <w:t xml:space="preserve">第4.2条第（8）项</w:t>
+        <w:t xml:space="preserve">第4.2条第（5）项</w:t>
       </w:r>
     </w:p>
     <w:p>
@@ -1440,7 +1440,7 @@
           <w:sz w:val="24"/>
           <w:szCs w:val="24"/>
         </w:rPr>
-        <w:t xml:space="preserve">第4.2条第（8）项　配合甲方对项目所有开发运营中的重要资产进行融资服务（包含根据甲方资料清单提供企业相关基础及财务资料，配合完成融资贷款支付流程），融资资金进入甲方账户，乙方不享受融资资金的任何权利，同时甲方需向乙方提供担保，保障矿山正常运行，融资责任和风险由甲方承担。</w:t>
+        <w:t xml:space="preserve">第4.2条第（5）项　乙方负责具体实施与落实安全环保管理、生态修复治理及属地矛盾纠纷协调等职责，包括但不限于编制并执行安全环保方案、开展日常隐患排查与治理、实施土地复垦及植被恢复、负责与矿区周边村组及居民进行沟通协调并处理相关纠纷等。履行上述职责所产生的全部费用（包括但不限于矿山开采过程中的行政规费、第三方服务费、补偿款、协调支出及其他相关开支）均由乙方承担。因乙方未按约定履行上述职责，导致甲方被行政处罚、被追究法律责任或遭受其他损失的，乙方应赔偿甲方全部损失。</w:t>
       </w:r>
     </w:p>
     <w:p>
@@ -1484,7 +1484,7 @@
           <w:sz w:val="24"/>
           <w:szCs w:val="24"/>
         </w:rPr>
-        <w:t xml:space="preserve">本项融资是甲方自身融资需求，与本项目建设无关，不应写成建设资金，也不应要求专款专用本项目。原文「对项目所有开发运营中的重要资产进行融资」，可能把乙方投入的设备、机具、共管账户内乙方资金拿去抵押，贷款人追及乙方。甲方对乙方没有支付工程款或进度款的义务，「担保」不是向乙方付款，而是隔离乙方、由甲方承担全部融资责任。乙方配合限于资料，不得成为借款人、保证人、出质人。</w:t>
+        <w:t xml:space="preserve">承包费、村补、生态修复金已有标准。本项再开「全部费用」，等于在付承包费之外无限加码，直接吃掉第7.2条「剩余经营收入归乙方」。</w:t>
       </w:r>
     </w:p>
     <w:p>
@@ -1545,7 +1545,7 @@
           <w:sz w:val="24"/>
           <w:szCs w:val="24"/>
         </w:rPr>
-        <w:t xml:space="preserve">第4.2条第（8）项</w:t>
+        <w:t xml:space="preserve">第4.2条第（5）项</w:t>
       </w:r>
     </w:p>
     <w:p>
@@ -1560,67 +1560,7 @@
           <w:sz w:val="24"/>
           <w:szCs w:val="24"/>
         </w:rPr>
-        <w:t xml:space="preserve">甲方基于自身融资需求办理融资的，与本项目建设投资、第5.1条共管资金及乙方投入无关。乙方仅配合提供依法可以公开的企业基础及财务资料，配合完成甲方融资所需的必要手续。</w:t>
-      </w:r>
-    </w:p>
-    <w:p>
-      <w:pPr>
-        <w:shd w:fill="F4F7FB" w:val="clear"/>
-        <w:spacing w:after="80"/>
-        <w:ind w:left="360"/>
-      </w:pPr>
-      <w:r>
-        <w:rPr>
-          <w:rFonts w:ascii="Times New Roman" w:eastAsia="宋体" w:hAnsi="Times New Roman"/>
-          <w:sz w:val="24"/>
-          <w:szCs w:val="24"/>
-        </w:rPr>
-        <w:t xml:space="preserve">融资合同的借款人、保证人、抵押人、出质人仅为甲方。不以乙方为借款人、保证人、出质人或差额补足、回购义务人。未经乙方书面同意，不得将乙方投入的设备、机具、共管账户内乙方资金及乙方依本协议投入的其他财产设定抵押、质押或被追及。第9.2条项下采矿权抵押变更仍按该条执行。</w:t>
-      </w:r>
-    </w:p>
-    <w:p>
-      <w:pPr>
-        <w:shd w:fill="F4F7FB" w:val="clear"/>
-        <w:spacing w:after="80"/>
-        <w:ind w:left="360"/>
-      </w:pPr>
-      <w:r>
-        <w:rPr>
-          <w:rFonts w:ascii="Times New Roman" w:eastAsia="宋体" w:hAnsi="Times New Roman"/>
-          <w:sz w:val="24"/>
-          <w:szCs w:val="24"/>
-        </w:rPr>
-        <w:t xml:space="preserve">融资资金进入甲方账户。乙方不享有该资金的任何权利，亦不承担该融资项下任何还款、担保、补足义务。该资金不视为乙方已支付承包费或预付款，不得抵作第7.1条项下乙方应付费用。</w:t>
-      </w:r>
-    </w:p>
-    <w:p>
-      <w:pPr>
-        <w:shd w:fill="F4F7FB" w:val="clear"/>
-        <w:spacing w:after="80"/>
-        <w:ind w:left="360"/>
-      </w:pPr>
-      <w:r>
-        <w:rPr>
-          <w:rFonts w:ascii="Times New Roman" w:eastAsia="宋体" w:hAnsi="Times New Roman"/>
-          <w:sz w:val="24"/>
-          <w:szCs w:val="24"/>
-        </w:rPr>
-        <w:t xml:space="preserve">因该融资产生的全部责任、债务、利息、罚息、违约、诉讼、保全、执行及对第三人的赔偿，均由甲方自行承担。甲方应确保该融资不影响乙方依本协议投资建设、开采、加工、销售。若因该融资导致贷款人或任何第三人向乙方主张权利，或查封、扣押、冻结乙方投入资产、共管账户内乙方资金，或导致停产、停磅的，甲方应负责解封并排除妨碍，于15日内返还剩余预付款及履约保证金，并赔偿乙方因此发生的直接损失。</w:t>
-      </w:r>
-    </w:p>
-    <w:p>
-      <w:pPr>
-        <w:shd w:fill="F4F7FB" w:val="clear"/>
-        <w:spacing w:after="80"/>
-        <w:ind w:left="360"/>
-      </w:pPr>
-      <w:r>
-        <w:rPr>
-          <w:rFonts w:ascii="Times New Roman" w:eastAsia="宋体" w:hAnsi="Times New Roman"/>
-          <w:sz w:val="24"/>
-          <w:szCs w:val="24"/>
-        </w:rPr>
-        <w:t xml:space="preserve">甲方对乙方不负有支付工程款或进度款的义务。本项下甲方的义务是隔离乙方风险并承担全部融资责任，不构成向乙方付款的承诺。</w:t>
+        <w:t xml:space="preserve">乙方负责安全环保、生态修复及日常村组协调的现场实施。应由矿权人缴纳的行政规费、手续费按第2.5条由甲方承担。村级款项按第4.2条第（6）项执行。第（6）项以外、单笔超过10万元或当年累计超过50万元的协调补偿，须双方书面确认后方由乙方承担。因甲方未履行法定主体责任被处罚的，由甲方承担。</w:t>
       </w:r>
     </w:p>
     <w:p>
@@ -1675,7 +1615,7 @@
           <w:sz w:val="28"/>
           <w:szCs w:val="28"/>
         </w:rPr>
-        <w:t xml:space="preserve">第5.1条</w:t>
+        <w:t xml:space="preserve">第4.2条第（8）项</w:t>
       </w:r>
     </w:p>
     <w:p>
@@ -1719,7 +1659,7 @@
           <w:sz w:val="24"/>
           <w:szCs w:val="24"/>
         </w:rPr>
-        <w:t xml:space="preserve">第5.1条　承包协议签订后15日内，乙方应与甲方共同指定一家银行，开设项目基建资金共管账户，并由乙方一次性向该账户支付人民币1200万元，专项用于矿区基建、道路修建及相关配套设施等前期建设，按乙方的施工进度，以进度款的形式分步拨付给乙方。账户内资金的使用实行双签制，任何一笔款项的支付须经双方共同书面确认后方可执行。若项目建设尚未完成而账户余额不足以支付后续支出，由乙方负责及时补足。项目建设竣工验收合格后，由乙方负责支付相关工程建设质保金，基建共管账户即行解除。进度款支付流程：乙方根据施工进度提交付款申请及相关证明材料，甲方应在收到申请后【5】个工作日内予以确认并配合办理支付，因甲方拖延确认导致工期延误的，建设期相应顺延。本项目建设工程监理单位由甲方协商确定，监理费用从项目基建资金共管账户中列支。双方应在本项目工程建设过程中，严格依照国家及地方关于保障农民工工资支付的规定，同步开设农民工工资专用账户，专项用于支付农民工工资。</w:t>
+        <w:t xml:space="preserve">第4.2条第（8）项　配合甲方对项目所有开发运营中的重要资产进行融资服务（包含根据甲方资料清单提供企业相关基础及财务资料，配合完成融资贷款支付流程），融资资金进入甲方账户，乙方不享受融资资金的任何权利，同时甲方需向乙方提供担保，保障矿山正常运行，融资责任和风险由甲方承担。</w:t>
       </w:r>
     </w:p>
     <w:p>
@@ -1763,7 +1703,7 @@
           <w:sz w:val="24"/>
           <w:szCs w:val="24"/>
         </w:rPr>
-        <w:t xml:space="preserve">1200万元是乙方自己的建设资金，不是甲方应付工程款。不足即补没有预算上限；甲方拖延双签，乙方的钱被锁死，建设期仍可能被认定逾期，进而触发无偿移交。监理由甲方单方确定却从乙方资金列支。</w:t>
+        <w:t xml:space="preserve">本项融资是甲方自身融资需求，与本项目建设无关，不应写成建设资金，也不应要求专款专用本项目。原文「对项目所有开发运营中的重要资产进行融资」，可能把乙方投入的设备、机具、共管账户内乙方资金拿去抵押，贷款人追及乙方。甲方对乙方没有支付工程款或进度款的义务，「担保」不是向乙方付款，而是隔离乙方、由甲方承担全部融资责任。乙方配合限于资料，不得成为借款人、保证人、出质人。</w:t>
       </w:r>
     </w:p>
     <w:p>
@@ -1824,7 +1764,7 @@
           <w:sz w:val="24"/>
           <w:szCs w:val="24"/>
         </w:rPr>
-        <w:t xml:space="preserve">第5.1条</w:t>
+        <w:t xml:space="preserve">第4.2条第（8）项</w:t>
       </w:r>
     </w:p>
     <w:p>
@@ -1839,7 +1779,67 @@
           <w:sz w:val="24"/>
           <w:szCs w:val="24"/>
         </w:rPr>
-        <w:t xml:space="preserve">本协议签订后15日内开设基建共管账户。乙方存入人民币1200万元，为乙方自有建设资金，专项用于矿区基建、道路及配套，双签支取。按施工进度拨付至乙方，性质为乙方支用己方资金，不构成甲方向乙方付款。补足以双方书面确认的建设预算为限。乙方提交支取申请后，甲方应在5个工作日内确认并配合办理；逾期确认的，建设期顺延。监理单位由双方协商确定；监理费从共管账户列支的，预算应事先书面确认。农民工工资专用账户同步开设。竣工验收合格并完成质保金安排后解除共管。</w:t>
+        <w:t xml:space="preserve">甲方基于自身融资需求办理融资的，与本项目建设投资、第5.1条共管资金及乙方投入无关。乙方仅配合提供依法可以公开的企业基础及财务资料，配合完成甲方融资所需的必要手续。</w:t>
+      </w:r>
+    </w:p>
+    <w:p>
+      <w:pPr>
+        <w:shd w:fill="F4F7FB" w:val="clear"/>
+        <w:spacing w:after="80"/>
+        <w:ind w:left="360"/>
+      </w:pPr>
+      <w:r>
+        <w:rPr>
+          <w:rFonts w:ascii="Times New Roman" w:eastAsia="宋体" w:hAnsi="Times New Roman"/>
+          <w:sz w:val="24"/>
+          <w:szCs w:val="24"/>
+        </w:rPr>
+        <w:t xml:space="preserve">融资合同的借款人、保证人、抵押人、出质人仅为甲方。不以乙方为借款人、保证人、出质人或差额补足、回购义务人。未经乙方书面同意，不得将乙方投入的设备、机具、共管账户内乙方资金及乙方依本协议投入的其他财产设定抵押、质押或被追及。第9.2条项下采矿权抵押变更仍按该条执行。</w:t>
+      </w:r>
+    </w:p>
+    <w:p>
+      <w:pPr>
+        <w:shd w:fill="F4F7FB" w:val="clear"/>
+        <w:spacing w:after="80"/>
+        <w:ind w:left="360"/>
+      </w:pPr>
+      <w:r>
+        <w:rPr>
+          <w:rFonts w:ascii="Times New Roman" w:eastAsia="宋体" w:hAnsi="Times New Roman"/>
+          <w:sz w:val="24"/>
+          <w:szCs w:val="24"/>
+        </w:rPr>
+        <w:t xml:space="preserve">融资资金进入甲方账户。乙方不享有该资金的任何权利，亦不承担该融资项下任何还款、担保、补足义务。该资金不视为乙方已支付承包费或预付款，不得抵作第7.1条项下乙方应付费用。</w:t>
+      </w:r>
+    </w:p>
+    <w:p>
+      <w:pPr>
+        <w:shd w:fill="F4F7FB" w:val="clear"/>
+        <w:spacing w:after="80"/>
+        <w:ind w:left="360"/>
+      </w:pPr>
+      <w:r>
+        <w:rPr>
+          <w:rFonts w:ascii="Times New Roman" w:eastAsia="宋体" w:hAnsi="Times New Roman"/>
+          <w:sz w:val="24"/>
+          <w:szCs w:val="24"/>
+        </w:rPr>
+        <w:t xml:space="preserve">因该融资产生的全部责任、债务、利息、罚息、违约、诉讼、保全、执行及对第三人的赔偿，均由甲方自行承担。甲方应确保该融资不影响乙方依本协议投资建设、开采、加工、销售。若因该融资导致贷款人或任何第三人向乙方主张权利，或查封、扣押、冻结乙方投入资产、共管账户内乙方资金，或导致停产、停磅的，甲方应负责解封并排除妨碍，于15日内返还剩余预付款及履约保证金，并赔偿乙方因此发生的直接损失。</w:t>
+      </w:r>
+    </w:p>
+    <w:p>
+      <w:pPr>
+        <w:shd w:fill="F4F7FB" w:val="clear"/>
+        <w:spacing w:after="80"/>
+        <w:ind w:left="360"/>
+      </w:pPr>
+      <w:r>
+        <w:rPr>
+          <w:rFonts w:ascii="Times New Roman" w:eastAsia="宋体" w:hAnsi="Times New Roman"/>
+          <w:sz w:val="24"/>
+          <w:szCs w:val="24"/>
+        </w:rPr>
+        <w:t xml:space="preserve">甲方对乙方不负有支付工程款或进度款的义务。本项下甲方的义务是隔离乙方风险并承担全部融资责任，不构成向乙方付款的承诺。</w:t>
       </w:r>
     </w:p>
     <w:p>
@@ -1894,7 +1894,7 @@
           <w:sz w:val="28"/>
           <w:szCs w:val="28"/>
         </w:rPr>
-        <w:t xml:space="preserve">第6.1条</w:t>
+        <w:t xml:space="preserve">第5.1条</w:t>
       </w:r>
     </w:p>
     <w:p>
@@ -1938,7 +1938,7 @@
           <w:sz w:val="24"/>
           <w:szCs w:val="24"/>
         </w:rPr>
-        <w:t xml:space="preserve">第6.1条　承包期限：自本协议签订之日起至2034年1月15日止。若板岩总量820.65万吨（砖用板岩矿158.86万吨，建筑用板岩矿661.79万吨）资源提前开采完成则承包期提前终止。</w:t>
+        <w:t xml:space="preserve">第5.1条　承包协议签订后15日内，乙方应与甲方共同指定一家银行，开设项目基建资金共管账户，并由乙方一次性向该账户支付人民币1200万元，专项用于矿区基建、道路修建及相关配套设施等前期建设，按乙方的施工进度，以进度款的形式分步拨付给乙方。账户内资金的使用实行双签制，任何一笔款项的支付须经双方共同书面确认后方可执行。若项目建设尚未完成而账户余额不足以支付后续支出，由乙方负责及时补足。项目建设竣工验收合格后，由乙方负责支付相关工程建设质保金，基建共管账户即行解除。进度款支付流程：乙方根据施工进度提交付款申请及相关证明材料，甲方应在收到申请后【5】个工作日内予以确认并配合办理支付，因甲方拖延确认导致工期延误的，建设期相应顺延。本项目建设工程监理单位由甲方协商确定，监理费用从项目基建资金共管账户中列支。双方应在本项目工程建设过程中，严格依照国家及地方关于保障农民工工资支付的规定，同步开设农民工工资专用账户，专项用于支付农民工工资。</w:t>
       </w:r>
     </w:p>
     <w:p>
@@ -1982,7 +1982,7 @@
           <w:sz w:val="24"/>
           <w:szCs w:val="24"/>
         </w:rPr>
-        <w:t xml:space="preserve">砖用板岩由乙方自行处置（第2.4条），却计入820.65万吨「开采完毕」，容易触发第11.3条、第12.2.5条无偿移交。计费储量与考核储量必须一致。</w:t>
+        <w:t xml:space="preserve">1200万元是乙方自己的建设资金，不是甲方应付工程款。不足即补没有预算上限；甲方拖延双签，乙方的钱被锁死，建设期仍可能被认定逾期，进而触发无偿移交。监理由甲方单方确定却从乙方资金列支。</w:t>
       </w:r>
     </w:p>
     <w:p>
@@ -2043,7 +2043,7 @@
           <w:sz w:val="24"/>
           <w:szCs w:val="24"/>
         </w:rPr>
-        <w:t xml:space="preserve">第6.1条</w:t>
+        <w:t xml:space="preserve">第5.1条</w:t>
       </w:r>
     </w:p>
     <w:p>
@@ -2058,7 +2058,7 @@
           <w:sz w:val="24"/>
           <w:szCs w:val="24"/>
         </w:rPr>
-        <w:t xml:space="preserve">承包期限自本协议签订之日起至2034年1月15日止。计费及「开采完毕」考核以建筑用板岩661.79万吨的过磅销售量为准。砖用板岩158.86万吨不计入「开采完毕」考核，除另有书面约定外不另计第7.1条保底承包费。</w:t>
+        <w:t xml:space="preserve">本协议签订后15日内开设基建共管账户。乙方存入人民币1200万元，为乙方自有建设资金，专项用于矿区基建、道路及配套，双签支取。按施工进度拨付至乙方，性质为乙方支用己方资金，不构成甲方向乙方付款。补足以双方书面确认的建设预算为限。乙方提交支取申请后，甲方应在5个工作日内确认并配合办理；逾期确认的，建设期顺延。监理单位由双方协商确定；监理费从共管账户列支的，预算应事先书面确认。农民工工资专用账户同步开设。竣工验收合格并完成质保金安排后解除共管。</w:t>
       </w:r>
     </w:p>
     <w:p>
@@ -2113,7 +2113,7 @@
           <w:sz w:val="28"/>
           <w:szCs w:val="28"/>
         </w:rPr>
-        <w:t xml:space="preserve">第7.1条第（3）项</w:t>
+        <w:t xml:space="preserve">第6.1条</w:t>
       </w:r>
     </w:p>
     <w:p>
@@ -2157,7 +2157,7 @@
           <w:sz w:val="24"/>
           <w:szCs w:val="24"/>
         </w:rPr>
-        <w:t xml:space="preserve">第7.1条第（3）项　预付款滚动结算：项目投产后，按磅房实际过磅吨数和实际销售单价计算抵扣，从预付款中逐笔扣除。预付款余额不足100万元（含）时，甲方向乙方下达预警通知，乙方应在收到通知后及时补足不少于500万元的预付款。若乙方逾期未支付，且预付款余额低于50万元（含）时，甲方有权暂停磅房销售过磅闸机，直至乙方补足款项。</w:t>
+        <w:t xml:space="preserve">第6.1条　承包期限：自本协议签订之日起至2034年1月15日止。若板岩总量820.65万吨（砖用板岩矿158.86万吨，建筑用板岩矿661.79万吨）资源提前开采完成则承包期提前终止。</w:t>
       </w:r>
     </w:p>
     <w:p>
@@ -2201,7 +2201,7 @@
           <w:sz w:val="24"/>
           <w:szCs w:val="24"/>
         </w:rPr>
-        <w:t xml:space="preserve">乙方的回本方式是销售。「及时补足」无期限。甲方对账错误停磅时，销售中断，预付款和保证金被占压，并可能接上解除和无偿移交。</w:t>
+        <w:t xml:space="preserve">砖用板岩由乙方自行处置（第2.4条），却计入820.65万吨「开采完毕」，容易触发第11.3条、第12.2.5条无偿移交。计费储量与考核储量必须一致。</w:t>
       </w:r>
     </w:p>
     <w:p>
@@ -2262,7 +2262,7 @@
           <w:sz w:val="24"/>
           <w:szCs w:val="24"/>
         </w:rPr>
-        <w:t xml:space="preserve">第7.1条第（3）项</w:t>
+        <w:t xml:space="preserve">第6.1条</w:t>
       </w:r>
     </w:p>
     <w:p>
@@ -2277,7 +2277,7 @@
           <w:sz w:val="24"/>
           <w:szCs w:val="24"/>
         </w:rPr>
-        <w:t xml:space="preserve">预付款按过磅吨数和约定单价抵扣。余额不足100万元时，甲方应书面通知乙方，乙方在收到通知后10个工作日内补足不少于500万元。因甲方对账错误或计量系统故障停止过磅的，应立即恢复，并顺延受影响的期限。</w:t>
+        <w:t xml:space="preserve">承包期限自本协议签订之日起至2034年1月15日止。计费及「开采完毕」考核以建筑用板岩661.79万吨的过磅销售量为准。砖用板岩158.86万吨不计入「开采完毕」考核，除另有书面约定外不另计第7.1条保底承包费。</w:t>
       </w:r>
     </w:p>
     <w:p>
@@ -2332,7 +2332,7 @@
           <w:sz w:val="28"/>
           <w:szCs w:val="28"/>
         </w:rPr>
-        <w:t xml:space="preserve">第9.10条</w:t>
+        <w:t xml:space="preserve">第7.1条第（3）项</w:t>
       </w:r>
     </w:p>
     <w:p>
@@ -2376,7 +2376,7 @@
           <w:sz w:val="24"/>
           <w:szCs w:val="24"/>
         </w:rPr>
-        <w:t xml:space="preserve">第9.10条　乙方未按协议约定支付甲方承包费（含矿业权使用费、矿权租赁费等相关费用），甲方有权责令乙方立即停止采矿和加工销售等行为，并解除本协议。</w:t>
+        <w:t xml:space="preserve">第7.1条第（3）项　预付款滚动结算：项目投产后，按磅房实际过磅吨数和实际销售单价计算抵扣，从预付款中逐笔扣除。预付款余额不足100万元（含）时，甲方向乙方下达预警通知，乙方应在收到通知后及时补足不少于500万元的预付款。若乙方逾期未支付，且预付款余额低于50万元（含）时，甲方有权暂停磅房销售过磅闸机，直至乙方补足款项。</w:t>
       </w:r>
     </w:p>
     <w:p>
@@ -2420,7 +2420,7 @@
           <w:sz w:val="24"/>
           <w:szCs w:val="24"/>
         </w:rPr>
-        <w:t xml:space="preserve">无催告即停采并解除，过苛。解除后接第11.5条、第12.3条无偿移交，本金一次收走。</w:t>
+        <w:t xml:space="preserve">乙方的回本方式是销售。「及时补足」无期限。甲方对账错误停磅时，销售中断，预付款和保证金被占压，并可能接上解除和无偿移交。</w:t>
       </w:r>
     </w:p>
     <w:p>
@@ -2481,7 +2481,7 @@
           <w:sz w:val="24"/>
           <w:szCs w:val="24"/>
         </w:rPr>
-        <w:t xml:space="preserve">第9.10条</w:t>
+        <w:t xml:space="preserve">第7.1条第（3）项</w:t>
       </w:r>
     </w:p>
     <w:p>
@@ -2496,7 +2496,7 @@
           <w:sz w:val="24"/>
           <w:szCs w:val="24"/>
         </w:rPr>
-        <w:t xml:space="preserve">乙方未按约定支付承包费的，甲方应书面催告，给予不少于10个工作日的宽限期。宽限期满仍未支付的，甲方可以暂停过磅；仍不履行的，可以解除本协议。</w:t>
+        <w:t xml:space="preserve">预付款按过磅吨数和约定单价抵扣。余额不足100万元时，甲方应书面通知乙方，乙方在收到通知后10个工作日内补足不少于500万元。因甲方对账错误或计量系统故障停止过磅的，应立即恢复，并顺延受影响的期限。</w:t>
       </w:r>
     </w:p>
     <w:p>
@@ -2551,7 +2551,7 @@
           <w:sz w:val="28"/>
           <w:szCs w:val="28"/>
         </w:rPr>
-        <w:t xml:space="preserve">第10.6条</w:t>
+        <w:t xml:space="preserve">第9.10条</w:t>
       </w:r>
     </w:p>
     <w:p>
@@ -2595,7 +2595,7 @@
           <w:sz w:val="24"/>
           <w:szCs w:val="24"/>
         </w:rPr>
-        <w:t xml:space="preserve">第10.6条　乙方应严格遵循规划与设计方案，完成矿山及加工场的基础设施工程和配套设施工程，并确保工程质量合格。若乙方负责的上述工程经整改后仍不合格，并给甲方造成100万元以上重大损失、存在重大安全隐患，或可能被职能部门予以严重处罚风险时，甲方有权终止本协议。乙方须无条件退出，并将已投入的基础设施、配套设施及所有设施设备无偿移交甲方接管。</w:t>
+        <w:t xml:space="preserve">第9.10条　乙方未按协议约定支付甲方承包费（含矿业权使用费、矿权租赁费等相关费用），甲方有权责令乙方立即停止采矿和加工销售等行为，并解除本协议。</w:t>
       </w:r>
     </w:p>
     <w:p>
@@ -2639,7 +2639,7 @@
           <w:sz w:val="24"/>
           <w:szCs w:val="24"/>
         </w:rPr>
-        <w:t xml:space="preserve">以「可能被处罚的风险」即可解除并无偿移交，标准过低。乙方自筹建设，现场投入是乙方本金。</w:t>
+        <w:t xml:space="preserve">无催告即停采并解除，过苛。解除后接第11.5条、第12.3条无偿移交，本金一次收走。</w:t>
       </w:r>
     </w:p>
     <w:p>
@@ -2700,7 +2700,7 @@
           <w:sz w:val="24"/>
           <w:szCs w:val="24"/>
         </w:rPr>
-        <w:t xml:space="preserve">第10.6条</w:t>
+        <w:t xml:space="preserve">第9.10条</w:t>
       </w:r>
     </w:p>
     <w:p>
@@ -2715,7 +2715,7 @@
           <w:sz w:val="24"/>
           <w:szCs w:val="24"/>
         </w:rPr>
-        <w:t xml:space="preserve">工程质量经整改后仍不合格，且有权机关认定存在重大安全隐患，或者已造成甲方实际损失超过100万元的，甲方可以解除本协议。解除后，可移动设备由乙方拆除运回；附着物按双方选定评估机构的评估净值结算，不得概括无偿移交。</w:t>
+        <w:t xml:space="preserve">乙方未按约定支付承包费的，甲方应书面催告，给予不少于10个工作日的宽限期。宽限期满仍未支付的，甲方可以暂停过磅；仍不履行的，可以解除本协议。</w:t>
       </w:r>
     </w:p>
     <w:p>
@@ -2770,7 +2770,7 @@
           <w:sz w:val="28"/>
           <w:szCs w:val="28"/>
         </w:rPr>
-        <w:t xml:space="preserve">第10.12条</w:t>
+        <w:t xml:space="preserve">第10.6条</w:t>
       </w:r>
     </w:p>
     <w:p>
@@ -2814,35 +2814,7 @@
           <w:sz w:val="24"/>
           <w:szCs w:val="24"/>
         </w:rPr>
-        <w:t xml:space="preserve">第10.12条　乙方系由湖南天木环保科技有限公司、湖南德晟矿山工程有限公司与岳阳宏祥爆破工程有限公司组成的联合体，湖南天木环保科技有限公司为牵头，甲方只对此牵头单位主张全部权利。</w:t>
-      </w:r>
-    </w:p>
-    <w:p>
-      <w:pPr>
-        <w:spacing w:after="80"/>
-        <w:jc w:val="left"/>
-      </w:pPr>
-      <w:r>
-        <w:rPr>
-          <w:rFonts w:ascii="Times New Roman" w:eastAsia="宋体" w:hAnsi="Times New Roman"/>
-          <w:sz w:val="24"/>
-          <w:szCs w:val="24"/>
-        </w:rPr>
-        <w:t xml:space="preserve">（1）联合体各方应确保其内部职责划分不削弱对甲方的任何义务，任何一方未履行或未完全履行合同义务的，甲方有权要求其他联合体成员承担连带责任。</w:t>
-      </w:r>
-    </w:p>
-    <w:p>
-      <w:pPr>
-        <w:spacing w:after="80"/>
-        <w:jc w:val="left"/>
-      </w:pPr>
-      <w:r>
-        <w:rPr>
-          <w:rFonts w:ascii="Times New Roman" w:eastAsia="宋体" w:hAnsi="Times New Roman"/>
-          <w:sz w:val="24"/>
-          <w:szCs w:val="24"/>
-        </w:rPr>
-        <w:t xml:space="preserve">（2）因乙方内部调整（如成员单位和相应职责变更），符合法律法规及遴选要求的，需提交书面报告经甲方同意，否则视为违约。</w:t>
+        <w:t xml:space="preserve">第10.6条　乙方应严格遵循规划与设计方案，完成矿山及加工场的基础设施工程和配套设施工程，并确保工程质量合格。若乙方负责的上述工程经整改后仍不合格，并给甲方造成100万元以上重大损失、存在重大安全隐患，或可能被职能部门予以严重处罚风险时，甲方有权终止本协议。乙方须无条件退出，并将已投入的基础设施、配套设施及所有设施设备无偿移交甲方接管。</w:t>
       </w:r>
     </w:p>
     <w:p>
@@ -2886,7 +2858,7 @@
           <w:sz w:val="24"/>
           <w:szCs w:val="24"/>
         </w:rPr>
-        <w:t xml:space="preserve">连带责任依法可维持。「甲方只对牵头单位主张全部权利」不能约束第三人，却可能导致停磅、解除、退还预付款和保证金只送达牵头人，其他成员的核心财产权落空。</w:t>
+        <w:t xml:space="preserve">以「可能被处罚的风险」即可解除并无偿移交，标准过低。乙方自筹建设，现场投入是乙方本金。</w:t>
       </w:r>
     </w:p>
     <w:p>
@@ -2947,7 +2919,7 @@
           <w:sz w:val="24"/>
           <w:szCs w:val="24"/>
         </w:rPr>
-        <w:t xml:space="preserve">第10.12条</w:t>
+        <w:t xml:space="preserve">第10.6条</w:t>
       </w:r>
     </w:p>
     <w:p>
@@ -2962,52 +2934,7 @@
           <w:sz w:val="24"/>
           <w:szCs w:val="24"/>
         </w:rPr>
-        <w:t xml:space="preserve">乙方系由湖南天木环保科技有限公司、湖南德晟矿山工程有限公司与岳阳宏祥爆破工程有限公司组成的联合体，湖南天木环保科技有限公司为牵头人。</w:t>
-      </w:r>
-    </w:p>
-    <w:p>
-      <w:pPr>
-        <w:shd w:fill="F4F7FB" w:val="clear"/>
-        <w:spacing w:after="80"/>
-        <w:ind w:left="360"/>
-      </w:pPr>
-      <w:r>
-        <w:rPr>
-          <w:rFonts w:ascii="Times New Roman" w:eastAsia="宋体" w:hAnsi="Times New Roman"/>
-          <w:sz w:val="24"/>
-          <w:szCs w:val="24"/>
-        </w:rPr>
-        <w:t xml:space="preserve">（1）内部职责划分不削弱对甲方的义务。任一成员未履行的，甲方有权要求联合体成员承担连带责任。</w:t>
-      </w:r>
-    </w:p>
-    <w:p>
-      <w:pPr>
-        <w:shd w:fill="F4F7FB" w:val="clear"/>
-        <w:spacing w:after="80"/>
-        <w:ind w:left="360"/>
-      </w:pPr>
-      <w:r>
-        <w:rPr>
-          <w:rFonts w:ascii="Times New Roman" w:eastAsia="宋体" w:hAnsi="Times New Roman"/>
-          <w:sz w:val="24"/>
-          <w:szCs w:val="24"/>
-        </w:rPr>
-        <w:t xml:space="preserve">（2）付款催告、停磅、解除及预付款、保证金的退还，应向乙方作出；仅送达牵头人的，对未收到通知的成员不发生该等意思表示的效力，但法律另有规定的除外。</w:t>
-      </w:r>
-    </w:p>
-    <w:p>
-      <w:pPr>
-        <w:shd w:fill="F4F7FB" w:val="clear"/>
-        <w:spacing w:after="80"/>
-        <w:ind w:left="360"/>
-      </w:pPr>
-      <w:r>
-        <w:rPr>
-          <w:rFonts w:ascii="Times New Roman" w:eastAsia="宋体" w:hAnsi="Times New Roman"/>
-          <w:sz w:val="24"/>
-          <w:szCs w:val="24"/>
-        </w:rPr>
-        <w:t xml:space="preserve">（3）成员单位变更须符合遴选要求，并书面报告经甲方同意。</w:t>
+        <w:t xml:space="preserve">工程质量经整改后仍不合格，且有权机关认定存在重大安全隐患，或者已造成甲方实际损失超过100万元的，甲方可以解除本协议。解除后，可移动设备由乙方拆除运回；附着物按双方选定评估机构的评估净值结算，不得概括无偿移交。</w:t>
       </w:r>
     </w:p>
     <w:p>
@@ -3062,7 +2989,7 @@
           <w:sz w:val="28"/>
           <w:szCs w:val="28"/>
         </w:rPr>
-        <w:t xml:space="preserve">第11.2条</w:t>
+        <w:t xml:space="preserve">第10.12条</w:t>
       </w:r>
     </w:p>
     <w:p>
@@ -3106,7 +3033,35 @@
           <w:sz w:val="24"/>
           <w:szCs w:val="24"/>
         </w:rPr>
-        <w:t xml:space="preserve">第11.2条　承包期限届满，现有评估可采资源储量板岩总量820.65万吨（砖用板岩矿158.86万吨，建筑用板岩矿661.79万吨）开采完毕，则承包协议终止。乙方应在期满后90日内，自行拆除并运回其投入的可移动设备、设施。对于已与土地附着、无法移动、不可拆除，或拆除会导致财产价值减损的建筑物、构筑物、设备、设施，乙方自愿无偿赠与给甲方，甲方有权单方处置且无需向乙方支付相应补偿款。如上述建筑物、构筑物及附着物、设施、设备需要拆除、运输，其处置费用由乙方承担，甲方有权扣除乙方的履约保证金予以抵扣支付。</w:t>
+        <w:t xml:space="preserve">第10.12条　乙方系由湖南天木环保科技有限公司、湖南德晟矿山工程有限公司与岳阳宏祥爆破工程有限公司组成的联合体，湖南天木环保科技有限公司为牵头，甲方只对此牵头单位主张全部权利。</w:t>
+      </w:r>
+    </w:p>
+    <w:p>
+      <w:pPr>
+        <w:spacing w:after="80"/>
+        <w:jc w:val="left"/>
+      </w:pPr>
+      <w:r>
+        <w:rPr>
+          <w:rFonts w:ascii="Times New Roman" w:eastAsia="宋体" w:hAnsi="Times New Roman"/>
+          <w:sz w:val="24"/>
+          <w:szCs w:val="24"/>
+        </w:rPr>
+        <w:t xml:space="preserve">（1）联合体各方应确保其内部职责划分不削弱对甲方的任何义务，任何一方未履行或未完全履行合同义务的，甲方有权要求其他联合体成员承担连带责任。</w:t>
+      </w:r>
+    </w:p>
+    <w:p>
+      <w:pPr>
+        <w:spacing w:after="80"/>
+        <w:jc w:val="left"/>
+      </w:pPr>
+      <w:r>
+        <w:rPr>
+          <w:rFonts w:ascii="Times New Roman" w:eastAsia="宋体" w:hAnsi="Times New Roman"/>
+          <w:sz w:val="24"/>
+          <w:szCs w:val="24"/>
+        </w:rPr>
+        <w:t xml:space="preserve">（2）因乙方内部调整（如成员单位和相应职责变更），符合法律法规及遴选要求的，需提交书面报告经甲方同意，否则视为违约。</w:t>
       </w:r>
     </w:p>
     <w:p>
@@ -3150,7 +3105,25 @@
           <w:sz w:val="24"/>
           <w:szCs w:val="24"/>
         </w:rPr>
-        <w:t xml:space="preserve">期满正常终止仍无偿取得承包人投入，拆除费由承包人承担，并可扣保证金。甲方无向乙方支付工程款的义务，退出结算应是评估净值或折抵未结承包费，不能写成进度款。</w:t>
+        <w:t xml:space="preserve">已签订《联合体协议书》第三条、第四条已写明连带责任和三家分工：乙方一（天木）对外联络、资金账户、销售及协助融资；乙方二（德晟）实施剥离、开采、转运并提供设备人员；乙方三（宏祥）实施爆破。承包协议书仅列联合体名称和牵头人，第2.6条、第4.2条一律写「乙方」，</w:t>
+      </w:r>
+      <w:r>
+        <w:rPr>
+          <w:rFonts w:ascii="Times New Roman" w:eastAsia="宋体" w:hAnsi="Times New Roman"/>
+          <w:b/>
+          <w:bCs/>
+          <w:sz w:val="24"/>
+          <w:szCs w:val="24"/>
+        </w:rPr>
+        <w:t xml:space="preserve">未将上述分工订入本合同</w:t>
+      </w:r>
+      <w:r>
+        <w:rPr>
+          <w:rFonts w:ascii="Times New Roman" w:eastAsia="宋体" w:hAnsi="Times New Roman"/>
+          <w:sz w:val="24"/>
+          <w:szCs w:val="24"/>
+        </w:rPr>
+        <w:t xml:space="preserve">。结果是：对甲方仍可向三家连带主张，合同正文却看不出谁实际采掘、谁实际爆破，与《联合体协议书》第四条、第1.3条及矿安〔2026〕78号要求的实际实施脱节。「甲方只对牵头单位主张全部权利」不能约束第三人，却可能导致停磅、解除、退还预付款和保证金只送达牵头人。</w:t>
       </w:r>
     </w:p>
     <w:p>
@@ -3211,7 +3184,7 @@
           <w:sz w:val="24"/>
           <w:szCs w:val="24"/>
         </w:rPr>
-        <w:t xml:space="preserve">第11.2条</w:t>
+        <w:t xml:space="preserve">第10.12条</w:t>
       </w:r>
     </w:p>
     <w:p>
@@ -3226,7 +3199,145 @@
           <w:sz w:val="24"/>
           <w:szCs w:val="24"/>
         </w:rPr>
-        <w:t xml:space="preserve">期限届满且按第6.1条考核开采完毕的，本协议终止。可移动设备由乙方于90日内拆除运回。附着物由双方共同选定的评估机构评估净值，由甲方按评估净值回购或折抵未结承包费；协商不成的，按评估净值的70%结算。</w:t>
+        <w:t xml:space="preserve">乙方系由湖南天木环保科技有限公司（乙方一、牵头人）、湖南德晟矿山工程有限公司（乙方二）、岳阳宏祥爆破工程有限公司（乙方三）组成的联合体。已签订的《联合体协议书》作为本合同附件。</w:t>
+      </w:r>
+    </w:p>
+    <w:p>
+      <w:pPr>
+        <w:shd w:fill="F4F7FB" w:val="clear"/>
+        <w:spacing w:after="80"/>
+        <w:ind w:left="360"/>
+      </w:pPr>
+      <w:r>
+        <w:rPr>
+          <w:rFonts w:ascii="Times New Roman" w:eastAsia="宋体" w:hAnsi="Times New Roman"/>
+          <w:sz w:val="24"/>
+          <w:szCs w:val="24"/>
+        </w:rPr>
+        <w:t xml:space="preserve">（1）内部职责划分不削弱对甲方的义务。牵头人签署、处理的事项，联合体各成员均予承认。任一成员未履行或未完全履行的，甲方有权要求联合体成员承担连带责任。删除「甲方只对此牵头单位主张全部权利」。</w:t>
+      </w:r>
+    </w:p>
+    <w:p>
+      <w:pPr>
+        <w:shd w:fill="F4F7FB" w:val="clear"/>
+        <w:spacing w:after="80"/>
+        <w:ind w:left="360"/>
+      </w:pPr>
+      <w:r>
+        <w:rPr>
+          <w:rFonts w:ascii="Times New Roman" w:eastAsia="宋体" w:hAnsi="Times New Roman"/>
+          <w:sz w:val="24"/>
+          <w:szCs w:val="24"/>
+        </w:rPr>
+        <w:t xml:space="preserve">（2）付款催告、停磅、解除及预付款、保证金的退还，应向乙方作出；仅送达牵头人的，对未收到通知的成员不发生该等意思表示的效力，但法律另有规定的除外。</w:t>
+      </w:r>
+    </w:p>
+    <w:p>
+      <w:pPr>
+        <w:shd w:fill="F4F7FB" w:val="clear"/>
+        <w:spacing w:after="80"/>
+        <w:ind w:left="360"/>
+      </w:pPr>
+      <w:r>
+        <w:rPr>
+          <w:rFonts w:ascii="Times New Roman" w:eastAsia="宋体" w:hAnsi="Times New Roman"/>
+          <w:sz w:val="24"/>
+          <w:szCs w:val="24"/>
+        </w:rPr>
+        <w:t xml:space="preserve">（3）成员单位和职责变更，须符合法律法规及遴选要求，并书面报告经甲方同意。</w:t>
+      </w:r>
+    </w:p>
+    <w:p>
+      <w:pPr>
+        <w:shd w:fill="F4F7FB" w:val="clear"/>
+        <w:spacing w:after="80"/>
+        <w:ind w:left="360"/>
+      </w:pPr>
+      <w:r>
+        <w:rPr>
+          <w:rFonts w:ascii="Times New Roman" w:eastAsia="宋体" w:hAnsi="Times New Roman"/>
+          <w:sz w:val="24"/>
+          <w:szCs w:val="24"/>
+        </w:rPr>
+        <w:t xml:space="preserve">（4）联合体内部职责分工以已签订《联合体协议书》第四条为准，并作为本合同对内履约安排。各成员应按下列分工</w:t>
+      </w:r>
+      <w:r>
+        <w:rPr>
+          <w:rFonts w:ascii="Times New Roman" w:eastAsia="宋体" w:hAnsi="Times New Roman"/>
+          <w:b/>
+          <w:bCs/>
+          <w:sz w:val="24"/>
+          <w:szCs w:val="24"/>
+        </w:rPr>
+        <w:t xml:space="preserve">实际实施</w:t>
+      </w:r>
+      <w:r>
+        <w:rPr>
+          <w:rFonts w:ascii="Times New Roman" w:eastAsia="宋体" w:hAnsi="Times New Roman"/>
+          <w:sz w:val="24"/>
+          <w:szCs w:val="24"/>
+        </w:rPr>
+        <w:t xml:space="preserve">，不得仅提供资质、许可证而不实施：</w:t>
+      </w:r>
+    </w:p>
+    <w:p>
+      <w:pPr>
+        <w:shd w:fill="F4F7FB" w:val="clear"/>
+        <w:spacing w:after="80"/>
+        <w:ind w:left="360"/>
+      </w:pPr>
+      <w:r>
+        <w:rPr>
+          <w:rFonts w:ascii="Times New Roman" w:eastAsia="宋体" w:hAnsi="Times New Roman"/>
+          <w:sz w:val="24"/>
+          <w:szCs w:val="24"/>
+        </w:rPr>
+        <w:t xml:space="preserve">1. 乙方一（湖南天木环保科技有限公司）：统一对接甲方，负责文件递交、合同签署及日常联络；协调开设基建共管账户、生态修复及安全保障等专项账户，负责基建资金及履约保证金的缴存，资金支付实行双签，负责预付款衔接及账户余额补足中应由承包方履行的部分；负责石子料、机制砂销售、客户开拓及物流，对销售价格真实性负责；按第4.2条第（8）项配合甲方自身融资（融资资金进入甲方账户），不以乙方二、乙方三为借款人、保证人或出质人；承担绿色矿山、安全评价、环境影响评价等手续中约定由承包方承担的费用，负责镇村属地日常协调并承担《联合体协议书》约定的相关补偿，承担遴选过程第三方服务费用。</w:t>
+      </w:r>
+    </w:p>
+    <w:p>
+      <w:pPr>
+        <w:shd w:fill="F4F7FB" w:val="clear"/>
+        <w:spacing w:after="80"/>
+        <w:ind w:left="360"/>
+      </w:pPr>
+      <w:r>
+        <w:rPr>
+          <w:rFonts w:ascii="Times New Roman" w:eastAsia="宋体" w:hAnsi="Times New Roman"/>
+          <w:sz w:val="24"/>
+          <w:szCs w:val="24"/>
+        </w:rPr>
+        <w:t xml:space="preserve">2. 乙方二（湖南德晟矿山工程有限公司）：按规定实施矿山剥离、开采、转运等施工作业；提供施工所需机械设备及专业作业人员；编制施工组织设计、应急预案等技术文件，落实绿色矿山建设现场措施，配合竣工验收。</w:t>
+      </w:r>
+    </w:p>
+    <w:p>
+      <w:pPr>
+        <w:shd w:fill="F4F7FB" w:val="clear"/>
+        <w:spacing w:after="80"/>
+        <w:ind w:left="360"/>
+      </w:pPr>
+      <w:r>
+        <w:rPr>
+          <w:rFonts w:ascii="Times New Roman" w:eastAsia="宋体" w:hAnsi="Times New Roman"/>
+          <w:sz w:val="24"/>
+          <w:szCs w:val="24"/>
+        </w:rPr>
+        <w:t xml:space="preserve">3. 乙方三（岳阳宏祥爆破工程有限公司）：负责爆破方案设计、现场施工及全过程安全管控；办理公安部门爆破作业许可，落实爆破警戒、现场防护、爆后隐患排查，管控飞石、振动等风险；提供爆破专用设备及持证爆破作业人员。</w:t>
+      </w:r>
+    </w:p>
+    <w:p>
+      <w:pPr>
+        <w:shd w:fill="F4F7FB" w:val="clear"/>
+        <w:spacing w:after="80"/>
+        <w:ind w:left="360"/>
+      </w:pPr>
+      <w:r>
+        <w:rPr>
+          <w:rFonts w:ascii="Times New Roman" w:eastAsia="宋体" w:hAnsi="Times New Roman"/>
+          <w:sz w:val="24"/>
+          <w:szCs w:val="24"/>
+        </w:rPr>
+        <w:t xml:space="preserve">（5）前款分工为履约安排，不免除第（1）项连带责任，也不能对抗甲方。与《联合体协议书》第四条文字不一致的，以本款为准；本款未列明的，适用《联合体协议书》第四条。</w:t>
       </w:r>
     </w:p>
     <w:p>
@@ -3281,7 +3392,7 @@
           <w:sz w:val="28"/>
           <w:szCs w:val="28"/>
         </w:rPr>
-        <w:t xml:space="preserve">第11.3条</w:t>
+        <w:t xml:space="preserve">第11.2条</w:t>
       </w:r>
     </w:p>
     <w:p>
@@ -3325,7 +3436,7 @@
           <w:sz w:val="24"/>
           <w:szCs w:val="24"/>
         </w:rPr>
-        <w:t xml:space="preserve">第11.3条　承包期限届满，若乙方未按承包协议约定对现有评估可采资源储量板岩总量820.65万吨（砖用板岩矿158.86万吨，建筑用板岩矿661.79万吨）开采完毕（因国家政策调整等不可抗力因素除外），则终止承包，乙方无条件退出，乙方在项目现场投入的所有设备、设施、建筑物、构筑物及附着物无偿归甲方所有，甲方有权单方处置。如上述建筑物、构筑物及附着物、设施、设备需要拆除、运输，其处置费用由乙方承担，甲方有权扣除乙方的履约保证金予以抵扣支付。</w:t>
+        <w:t xml:space="preserve">第11.2条　承包期限届满，现有评估可采资源储量板岩总量820.65万吨（砖用板岩矿158.86万吨，建筑用板岩矿661.79万吨）开采完毕，则承包协议终止。乙方应在期满后90日内，自行拆除并运回其投入的可移动设备、设施。对于已与土地附着、无法移动、不可拆除，或拆除会导致财产价值减损的建筑物、构筑物、设备、设施，乙方自愿无偿赠与给甲方，甲方有权单方处置且无需向乙方支付相应补偿款。如上述建筑物、构筑物及附着物、设施、设备需要拆除、运输，其处置费用由乙方承担，甲方有权扣除乙方的履约保证金予以抵扣支付。</w:t>
       </w:r>
     </w:p>
     <w:p>
@@ -3369,7 +3480,7 @@
           <w:sz w:val="24"/>
           <w:szCs w:val="24"/>
         </w:rPr>
-        <w:t xml:space="preserve">砖用板岩计入820.65万吨即触发无偿接收。政策、证照、储量不实导致未采完的，不应按乙方违约无偿移交。</w:t>
+        <w:t xml:space="preserve">期满正常终止仍无偿取得承包人投入，拆除费由承包人承担，并可扣保证金。甲方无向乙方支付工程款的义务，退出结算应是评估净值或折抵未结承包费，不能写成进度款。</w:t>
       </w:r>
     </w:p>
     <w:p>
@@ -3430,7 +3541,7 @@
           <w:sz w:val="24"/>
           <w:szCs w:val="24"/>
         </w:rPr>
-        <w:t xml:space="preserve">第11.3条</w:t>
+        <w:t xml:space="preserve">第11.2条</w:t>
       </w:r>
     </w:p>
     <w:p>
@@ -3445,7 +3556,7 @@
           <w:sz w:val="24"/>
           <w:szCs w:val="24"/>
         </w:rPr>
-        <w:t xml:space="preserve">因政策、证照、储量不实、压覆、红线或不可抗力未能按第6.1条开采完毕的，适用第11.6条，资产不得无偿归甲方，甲方返还剩余预付款及履约保证金。因乙方原因未按第6.1条开采完毕的，附着物按第11.2条评估结算，不得概括无偿归甲方。</w:t>
+        <w:t xml:space="preserve">期限届满且按第6.1条考核开采完毕的，本协议终止。可移动设备由乙方于90日内拆除运回。附着物由双方共同选定的评估机构评估净值，由甲方按评估净值回购或折抵未结承包费；协商不成的，按评估净值的70%结算。</w:t>
       </w:r>
     </w:p>
     <w:p>
@@ -3500,7 +3611,7 @@
           <w:sz w:val="28"/>
           <w:szCs w:val="28"/>
         </w:rPr>
-        <w:t xml:space="preserve">第11.4条</w:t>
+        <w:t xml:space="preserve">第11.3条</w:t>
       </w:r>
     </w:p>
     <w:p>
@@ -3544,7 +3655,7 @@
           <w:sz w:val="24"/>
           <w:szCs w:val="24"/>
         </w:rPr>
-        <w:t xml:space="preserve">第11.4条　承包期限内，若现有评估可采资源储量板岩总量820.65万吨（砖用板岩矿158.86万吨，建筑用板岩矿661.79万吨）开采完毕，届时仍有可采资源储量且甲方取得行政主管部门批复的开采权并决定开发的，在同等条件下，乙方享有优先续约权。</w:t>
+        <w:t xml:space="preserve">第11.3条　承包期限届满，若乙方未按承包协议约定对现有评估可采资源储量板岩总量820.65万吨（砖用板岩矿158.86万吨，建筑用板岩矿661.79万吨）开采完毕（因国家政策调整等不可抗力因素除外），则终止承包，乙方无条件退出，乙方在项目现场投入的所有设备、设施、建筑物、构筑物及附着物无偿归甲方所有，甲方有权单方处置。如上述建筑物、构筑物及附着物、设施、设备需要拆除、运输，其处置费用由乙方承担，甲方有权扣除乙方的履约保证金予以抵扣支付。</w:t>
       </w:r>
     </w:p>
     <w:p>
@@ -3588,7 +3699,7 @@
           <w:sz w:val="24"/>
           <w:szCs w:val="24"/>
         </w:rPr>
-        <w:t xml:space="preserve">与第6.2条重复。优先续约无行权期限，甲方可拖延至承包人无法行权。</w:t>
+        <w:t xml:space="preserve">砖用板岩计入820.65万吨即触发无偿接收。政策、证照、储量不实导致未采完的，不应按乙方违约无偿移交。</w:t>
       </w:r>
     </w:p>
     <w:p>
@@ -3649,7 +3760,7 @@
           <w:sz w:val="24"/>
           <w:szCs w:val="24"/>
         </w:rPr>
-        <w:t xml:space="preserve">第11.4条</w:t>
+        <w:t xml:space="preserve">第11.3条</w:t>
       </w:r>
     </w:p>
     <w:p>
@@ -3664,7 +3775,7 @@
           <w:sz w:val="24"/>
           <w:szCs w:val="24"/>
         </w:rPr>
-        <w:t xml:space="preserve">建筑用板岩计费储量开采完毕后，如仍有可采资源且甲方取得批复并决定开发的，在同等条件（承包机制不劣于15.2元/吨及本协议阶梯规则）下，乙方享有优先续约权，行权期限不少于30日。放弃优先权须乙方书面同意。第6.2条与本条不一致的，以本条为准。</w:t>
+        <w:t xml:space="preserve">因政策、证照、储量不实、压覆、红线或不可抗力未能按第6.1条开采完毕的，适用第11.6条，资产不得无偿归甲方，甲方返还剩余预付款及履约保证金。因乙方原因未按第6.1条开采完毕的，附着物按第11.2条评估结算，不得概括无偿归甲方。</w:t>
       </w:r>
     </w:p>
     <w:p>
@@ -3719,7 +3830,7 @@
           <w:sz w:val="28"/>
           <w:szCs w:val="28"/>
         </w:rPr>
-        <w:t xml:space="preserve">第11.5条</w:t>
+        <w:t xml:space="preserve">第11.4条</w:t>
       </w:r>
     </w:p>
     <w:p>
@@ -3763,7 +3874,7 @@
           <w:sz w:val="24"/>
           <w:szCs w:val="24"/>
         </w:rPr>
-        <w:t xml:space="preserve">第11.5条　承包期内，如因乙方原因需提前终止承包期，乙方应无条件退出。乙方在项目现场投入的所有建筑物、构筑物及附着物、设施、设备无偿归甲方所有。如上述建筑物、构筑物及附着物、设施、设备需要拆除、运输，其处置费用由乙方承担，甲方有权扣除乙方的履约保证金予以抵扣支付。如因乙方原因给甲方造成的各项损失（直接损失、间接损失、维权成本等），乙方仍应予以足额赔偿。</w:t>
+        <w:t xml:space="preserve">第11.4条　承包期限内，若现有评估可采资源储量板岩总量820.65万吨（砖用板岩矿158.86万吨，建筑用板岩矿661.79万吨）开采完毕，届时仍有可采资源储量且甲方取得行政主管部门批复的开采权并决定开发的，在同等条件下，乙方享有优先续约权。</w:t>
       </w:r>
     </w:p>
     <w:p>
@@ -3807,7 +3918,7 @@
           <w:sz w:val="24"/>
           <w:szCs w:val="24"/>
         </w:rPr>
-        <w:t xml:space="preserve">「乙方原因」过宽。间接损失、维权成本与无偿移交叠加。因甲方原因或双方无过错终止的，不应无偿归甲方。甲方无支付工程款义务，应返还剩余预付款和保证金，并对附着物评估结算。</w:t>
+        <w:t xml:space="preserve">与第6.2条重复。优先续约无行权期限，甲方可拖延至承包人无法行权。</w:t>
       </w:r>
     </w:p>
     <w:p>
@@ -3868,7 +3979,7 @@
           <w:sz w:val="24"/>
           <w:szCs w:val="24"/>
         </w:rPr>
-        <w:t xml:space="preserve">第11.5条</w:t>
+        <w:t xml:space="preserve">第11.4条</w:t>
       </w:r>
     </w:p>
     <w:p>
@@ -3883,7 +3994,7 @@
           <w:sz w:val="24"/>
           <w:szCs w:val="24"/>
         </w:rPr>
-        <w:t xml:space="preserve">因乙方故意违约、违法转包，或发生有权机关认定的重大生产安全责任事故、重大突发环境事件，经书面催告未改正而提前终止的，甲方可以评估净值为限抵偿直接损失。因甲方原因或双方无过错提前终止的，资产不得无偿归甲方；甲方应返还剩余预付款及履约保证金，附着物按第11.2条评估结算。甲方无向乙方支付工程款或进度款的义务。</w:t>
+        <w:t xml:space="preserve">建筑用板岩计费储量开采完毕后，如仍有可采资源且甲方取得批复并决定开发的，在同等条件（承包机制不劣于15.2元/吨及本协议阶梯规则）下，乙方享有优先续约权，行权期限不少于30日。放弃优先权须乙方书面同意。第6.2条与本条不一致的，以本条为准。</w:t>
       </w:r>
     </w:p>
     <w:p>
@@ -3938,7 +4049,7 @@
           <w:sz w:val="28"/>
           <w:szCs w:val="28"/>
         </w:rPr>
-        <w:t xml:space="preserve">第12.1条</w:t>
+        <w:t xml:space="preserve">第11.5条</w:t>
       </w:r>
     </w:p>
     <w:p>
@@ -3982,7 +4093,7 @@
           <w:sz w:val="24"/>
           <w:szCs w:val="24"/>
         </w:rPr>
-        <w:t xml:space="preserve">第12.1条　乙方未按约定缴纳预付款，甲方有权暂停磅房销售过磅闸机，直至乙方付清全部款项。</w:t>
+        <w:t xml:space="preserve">第11.5条　承包期内，如因乙方原因需提前终止承包期，乙方应无条件退出。乙方在项目现场投入的所有建筑物、构筑物及附着物、设施、设备无偿归甲方所有。如上述建筑物、构筑物及附着物、设施、设备需要拆除、运输，其处置费用由乙方承担，甲方有权扣除乙方的履约保证金予以抵扣支付。如因乙方原因给甲方造成的各项损失（直接损失、间接损失、维权成本等），乙方仍应予以足额赔偿。</w:t>
       </w:r>
     </w:p>
     <w:p>
@@ -4026,7 +4137,7 @@
           <w:sz w:val="24"/>
           <w:szCs w:val="24"/>
         </w:rPr>
-        <w:t xml:space="preserve">与第7.1条第（3）项重复且无催告、无对账错误救济。</w:t>
+        <w:t xml:space="preserve">「乙方原因」过宽。间接损失、维权成本与无偿移交叠加。因甲方原因或双方无过错终止的，不应无偿归甲方。甲方无支付工程款义务，应返还剩余预付款和保证金，并对附着物评估结算。</w:t>
       </w:r>
     </w:p>
     <w:p>
@@ -4087,7 +4198,7 @@
           <w:sz w:val="24"/>
           <w:szCs w:val="24"/>
         </w:rPr>
-        <w:t xml:space="preserve">第12.1条</w:t>
+        <w:t xml:space="preserve">第11.5条</w:t>
       </w:r>
     </w:p>
     <w:p>
@@ -4102,7 +4213,7 @@
           <w:sz w:val="24"/>
           <w:szCs w:val="24"/>
         </w:rPr>
-        <w:t xml:space="preserve">预付款停止过磅按第7.1条第（3）项执行。</w:t>
+        <w:t xml:space="preserve">因乙方故意违约、违法转包，或发生有权机关认定的重大生产安全责任事故、重大突发环境事件，经书面催告未改正而提前终止的，甲方可以评估净值为限抵偿直接损失。因甲方原因或双方无过错提前终止的，资产不得无偿归甲方；甲方应返还剩余预付款及履约保证金，附着物按第11.2条评估结算。甲方无向乙方支付工程款或进度款的义务。</w:t>
       </w:r>
     </w:p>
     <w:p>
@@ -4157,7 +4268,7 @@
           <w:sz w:val="28"/>
           <w:szCs w:val="28"/>
         </w:rPr>
-        <w:t xml:space="preserve">第12.2条</w:t>
+        <w:t xml:space="preserve">第12.1条</w:t>
       </w:r>
     </w:p>
     <w:p>
@@ -4201,105 +4312,7 @@
           <w:sz w:val="24"/>
           <w:szCs w:val="24"/>
         </w:rPr>
-        <w:t xml:space="preserve">第12.2条　乙方有下列情形之一的，甲方有权解除本协议，并要求乙方承担12.3约定的违约责任：</w:t>
-      </w:r>
-    </w:p>
-    <w:p>
-      <w:pPr>
-        <w:spacing w:after="80"/>
-        <w:jc w:val="left"/>
-      </w:pPr>
-      <w:r>
-        <w:rPr>
-          <w:rFonts w:ascii="Times New Roman" w:eastAsia="宋体" w:hAnsi="Times New Roman"/>
-          <w:sz w:val="24"/>
-          <w:szCs w:val="24"/>
-        </w:rPr>
-        <w:t xml:space="preserve">12.2.1乙方违反本协议约定，对甲方或目标矿权有重大不利影响的。重大不利影响是指损失金额在100万元以上。</w:t>
-      </w:r>
-    </w:p>
-    <w:p>
-      <w:pPr>
-        <w:spacing w:after="80"/>
-        <w:jc w:val="left"/>
-      </w:pPr>
-      <w:r>
-        <w:rPr>
-          <w:rFonts w:ascii="Times New Roman" w:eastAsia="宋体" w:hAnsi="Times New Roman"/>
-          <w:sz w:val="24"/>
-          <w:szCs w:val="24"/>
-        </w:rPr>
-        <w:t xml:space="preserve">12.2.2项目出现重大安全生产责任事故或重大环境污染责任事故的。</w:t>
-      </w:r>
-    </w:p>
-    <w:p>
-      <w:pPr>
-        <w:spacing w:after="80"/>
-        <w:jc w:val="left"/>
-      </w:pPr>
-      <w:r>
-        <w:rPr>
-          <w:rFonts w:ascii="Times New Roman" w:eastAsia="宋体" w:hAnsi="Times New Roman"/>
-          <w:sz w:val="24"/>
-          <w:szCs w:val="24"/>
-        </w:rPr>
-        <w:t xml:space="preserve">12.2.3乙方违法转包、转租的。</w:t>
-      </w:r>
-    </w:p>
-    <w:p>
-      <w:pPr>
-        <w:spacing w:after="80"/>
-        <w:jc w:val="left"/>
-      </w:pPr>
-      <w:r>
-        <w:rPr>
-          <w:rFonts w:ascii="Times New Roman" w:eastAsia="宋体" w:hAnsi="Times New Roman"/>
-          <w:sz w:val="24"/>
-          <w:szCs w:val="24"/>
-        </w:rPr>
-        <w:t xml:space="preserve">12.2.4乙方进行违法经营，经甲方告知仍不改正的。</w:t>
-      </w:r>
-    </w:p>
-    <w:p>
-      <w:pPr>
-        <w:spacing w:after="80"/>
-        <w:jc w:val="left"/>
-      </w:pPr>
-      <w:r>
-        <w:rPr>
-          <w:rFonts w:ascii="Times New Roman" w:eastAsia="宋体" w:hAnsi="Times New Roman"/>
-          <w:sz w:val="24"/>
-          <w:szCs w:val="24"/>
-        </w:rPr>
-        <w:t xml:space="preserve">12.2.5在本协议期限内，乙方未按本协议约定将现有评估可采资源储量板岩总量820.65万吨开采完毕（因国家政策调整等不可抗力因素除外）。</w:t>
-      </w:r>
-    </w:p>
-    <w:p>
-      <w:pPr>
-        <w:spacing w:after="80"/>
-        <w:jc w:val="left"/>
-      </w:pPr>
-      <w:r>
-        <w:rPr>
-          <w:rFonts w:ascii="Times New Roman" w:eastAsia="宋体" w:hAnsi="Times New Roman"/>
-          <w:sz w:val="24"/>
-          <w:szCs w:val="24"/>
-        </w:rPr>
-        <w:t xml:space="preserve">12.2.6未按《关于规范金属非金属生产矿山采掘（剥）施工队伍的意见》（矿安〔2026〕78号）的工作要求整改到位。</w:t>
-      </w:r>
-    </w:p>
-    <w:p>
-      <w:pPr>
-        <w:spacing w:after="80"/>
-        <w:jc w:val="left"/>
-      </w:pPr>
-      <w:r>
-        <w:rPr>
-          <w:rFonts w:ascii="Times New Roman" w:eastAsia="宋体" w:hAnsi="Times New Roman"/>
-          <w:sz w:val="24"/>
-          <w:szCs w:val="24"/>
-        </w:rPr>
-        <w:t xml:space="preserve">12.2.7其他法定或约定的情形。</w:t>
+        <w:t xml:space="preserve">第12.1条　乙方未按约定缴纳预付款，甲方有权暂停磅房销售过磅闸机，直至乙方付清全部款项。</w:t>
       </w:r>
     </w:p>
     <w:p>
@@ -4343,7 +4356,7 @@
           <w:sz w:val="24"/>
           <w:szCs w:val="24"/>
         </w:rPr>
-        <w:t xml:space="preserve">100万元即可解除；未采完820.65万吨即可解除；整体托管手续、许可在甲方，逾期却罚乙方。解除后接第12.3条无偿接收和高额违约金。</w:t>
+        <w:t xml:space="preserve">与第7.1条第（3）项重复且无催告、无对账错误救济。</w:t>
       </w:r>
     </w:p>
     <w:p>
@@ -4404,7 +4417,7 @@
           <w:sz w:val="24"/>
           <w:szCs w:val="24"/>
         </w:rPr>
-        <w:t xml:space="preserve">第12.2条</w:t>
+        <w:t xml:space="preserve">第12.1条</w:t>
       </w:r>
     </w:p>
     <w:p>
@@ -4419,7 +4432,7 @@
           <w:sz w:val="24"/>
           <w:szCs w:val="24"/>
         </w:rPr>
-        <w:t xml:space="preserve">甲方据以解除的情形限于：有权机关认定发生重大生产安全责任事故或重大突发环境事件；乙方违法转包、转租；乙方逾期支付承包费或预付款，经书面催告后仍不履行；乙方未按矿安〔2026〕78号完成整改且可归责于乙方。因甲方不配合办理托管或许可导致逾期的，不得适用本条解除。删除以未采完820.65万吨作为解除事由；考核按第6.1条。删除「损失金额在100万元以上」作为单独解除标准。</w:t>
+        <w:t xml:space="preserve">预付款停止过磅按第7.1条第（3）项执行。</w:t>
       </w:r>
     </w:p>
     <w:p>
@@ -4474,7 +4487,7 @@
           <w:sz w:val="28"/>
           <w:szCs w:val="28"/>
         </w:rPr>
-        <w:t xml:space="preserve">第12.3条</w:t>
+        <w:t xml:space="preserve">第12.2条</w:t>
       </w:r>
     </w:p>
     <w:p>
@@ -4518,49 +4531,105 @@
           <w:sz w:val="24"/>
           <w:szCs w:val="24"/>
         </w:rPr>
-        <w:t xml:space="preserve">第12.3条　乙方违约导致甲方解除本协议，乙方应同时向甲方承担如下责任：</w:t>
-      </w:r>
-    </w:p>
-    <w:p>
-      <w:pPr>
-        <w:spacing w:after="80"/>
-        <w:jc w:val="left"/>
-      </w:pPr>
-      <w:r>
-        <w:rPr>
-          <w:rFonts w:ascii="Times New Roman" w:eastAsia="宋体" w:hAnsi="Times New Roman"/>
-          <w:sz w:val="24"/>
-          <w:szCs w:val="24"/>
-        </w:rPr>
-        <w:t xml:space="preserve">12.3.1立即退出目标矿权。若因乙方违约导致承包协议解除的，乙方所投资的基础建设和生产设施设备无偿归甲方所有。</w:t>
-      </w:r>
-    </w:p>
-    <w:p>
-      <w:pPr>
-        <w:spacing w:after="80"/>
-        <w:jc w:val="left"/>
-      </w:pPr>
-      <w:r>
-        <w:rPr>
-          <w:rFonts w:ascii="Times New Roman" w:eastAsia="宋体" w:hAnsi="Times New Roman"/>
-          <w:sz w:val="24"/>
-          <w:szCs w:val="24"/>
-        </w:rPr>
-        <w:t xml:space="preserve">12.3.2乙方未依约履行本协议及附件约定义务（职责）的，甲方有权按照其履约保证金（保函）总额的20％要求乙方承担违约金。违约金不足以弥补甲方损失的，甲方有权从履约保证金（保函）中进行扣付。履约保证金（保函）仍不足以弥补甲方损失的，甲方有权要求乙方全额赔偿其实际损失、间接损失、律师费、鉴定费、评估费、诉讼费等各项维权成本和费用。</w:t>
-      </w:r>
-    </w:p>
-    <w:p>
-      <w:pPr>
-        <w:spacing w:after="80"/>
-        <w:jc w:val="left"/>
-      </w:pPr>
-      <w:r>
-        <w:rPr>
-          <w:rFonts w:ascii="Times New Roman" w:eastAsia="宋体" w:hAnsi="Times New Roman"/>
-          <w:sz w:val="24"/>
-          <w:szCs w:val="24"/>
-        </w:rPr>
-        <w:t xml:space="preserve">12.3.3乙方违反本协议及附件约定或法律规定，未按要求整改，导致矿区存在被责令停业整顿或行政处罚风险的，甲方有权按照其履约保证金（保函）总额的30％要求乙方承担违约金。违约金不足以弥补甲方损失的，甲方有权从履约保证金（保函）中进行扣付。履约保证金（保函）仍不足以弥补甲方损失的，甲方有权要求乙方全额赔偿其实际损失、间接损失、律师费、鉴定费、评估费、诉讼费等各项维权成本和费用。</w:t>
+        <w:t xml:space="preserve">第12.2条　乙方有下列情形之一的，甲方有权解除本协议，并要求乙方承担12.3约定的违约责任：</w:t>
+      </w:r>
+    </w:p>
+    <w:p>
+      <w:pPr>
+        <w:spacing w:after="80"/>
+        <w:jc w:val="left"/>
+      </w:pPr>
+      <w:r>
+        <w:rPr>
+          <w:rFonts w:ascii="Times New Roman" w:eastAsia="宋体" w:hAnsi="Times New Roman"/>
+          <w:sz w:val="24"/>
+          <w:szCs w:val="24"/>
+        </w:rPr>
+        <w:t xml:space="preserve">12.2.1乙方违反本协议约定，对甲方或目标矿权有重大不利影响的。重大不利影响是指损失金额在100万元以上。</w:t>
+      </w:r>
+    </w:p>
+    <w:p>
+      <w:pPr>
+        <w:spacing w:after="80"/>
+        <w:jc w:val="left"/>
+      </w:pPr>
+      <w:r>
+        <w:rPr>
+          <w:rFonts w:ascii="Times New Roman" w:eastAsia="宋体" w:hAnsi="Times New Roman"/>
+          <w:sz w:val="24"/>
+          <w:szCs w:val="24"/>
+        </w:rPr>
+        <w:t xml:space="preserve">12.2.2项目出现重大安全生产责任事故或重大环境污染责任事故的。</w:t>
+      </w:r>
+    </w:p>
+    <w:p>
+      <w:pPr>
+        <w:spacing w:after="80"/>
+        <w:jc w:val="left"/>
+      </w:pPr>
+      <w:r>
+        <w:rPr>
+          <w:rFonts w:ascii="Times New Roman" w:eastAsia="宋体" w:hAnsi="Times New Roman"/>
+          <w:sz w:val="24"/>
+          <w:szCs w:val="24"/>
+        </w:rPr>
+        <w:t xml:space="preserve">12.2.3乙方违法转包、转租的。</w:t>
+      </w:r>
+    </w:p>
+    <w:p>
+      <w:pPr>
+        <w:spacing w:after="80"/>
+        <w:jc w:val="left"/>
+      </w:pPr>
+      <w:r>
+        <w:rPr>
+          <w:rFonts w:ascii="Times New Roman" w:eastAsia="宋体" w:hAnsi="Times New Roman"/>
+          <w:sz w:val="24"/>
+          <w:szCs w:val="24"/>
+        </w:rPr>
+        <w:t xml:space="preserve">12.2.4乙方进行违法经营，经甲方告知仍不改正的。</w:t>
+      </w:r>
+    </w:p>
+    <w:p>
+      <w:pPr>
+        <w:spacing w:after="80"/>
+        <w:jc w:val="left"/>
+      </w:pPr>
+      <w:r>
+        <w:rPr>
+          <w:rFonts w:ascii="Times New Roman" w:eastAsia="宋体" w:hAnsi="Times New Roman"/>
+          <w:sz w:val="24"/>
+          <w:szCs w:val="24"/>
+        </w:rPr>
+        <w:t xml:space="preserve">12.2.5在本协议期限内，乙方未按本协议约定将现有评估可采资源储量板岩总量820.65万吨开采完毕（因国家政策调整等不可抗力因素除外）。</w:t>
+      </w:r>
+    </w:p>
+    <w:p>
+      <w:pPr>
+        <w:spacing w:after="80"/>
+        <w:jc w:val="left"/>
+      </w:pPr>
+      <w:r>
+        <w:rPr>
+          <w:rFonts w:ascii="Times New Roman" w:eastAsia="宋体" w:hAnsi="Times New Roman"/>
+          <w:sz w:val="24"/>
+          <w:szCs w:val="24"/>
+        </w:rPr>
+        <w:t xml:space="preserve">12.2.6未按《关于规范金属非金属生产矿山采掘（剥）施工队伍的意见》（矿安〔2026〕78号）的工作要求整改到位。</w:t>
+      </w:r>
+    </w:p>
+    <w:p>
+      <w:pPr>
+        <w:spacing w:after="80"/>
+        <w:jc w:val="left"/>
+      </w:pPr>
+      <w:r>
+        <w:rPr>
+          <w:rFonts w:ascii="Times New Roman" w:eastAsia="宋体" w:hAnsi="Times New Roman"/>
+          <w:sz w:val="24"/>
+          <w:szCs w:val="24"/>
+        </w:rPr>
+        <w:t xml:space="preserve">12.2.7其他法定或约定的情形。</w:t>
       </w:r>
     </w:p>
     <w:p>
@@ -4604,7 +4673,7 @@
           <w:sz w:val="24"/>
           <w:szCs w:val="24"/>
         </w:rPr>
-        <w:t xml:space="preserve">「风险」即可处30%；20%、30%、无偿接收、间接损失、维权成本叠加，过分高于可预见损失。乙方已付承包费、预付款、保证金并自筹建设，这组条款可以把本金一次收走。</w:t>
+        <w:t xml:space="preserve">100万元即可解除；未采完820.65万吨即可解除；整体托管手续、许可在甲方，逾期却罚乙方。解除后接第12.3条无偿接收和高额违约金。</w:t>
       </w:r>
     </w:p>
     <w:p>
@@ -4665,7 +4734,7 @@
           <w:sz w:val="24"/>
           <w:szCs w:val="24"/>
         </w:rPr>
-        <w:t xml:space="preserve">第12.3条</w:t>
+        <w:t xml:space="preserve">第12.2条</w:t>
       </w:r>
     </w:p>
     <w:p>
@@ -4680,7 +4749,7 @@
           <w:sz w:val="24"/>
           <w:szCs w:val="24"/>
         </w:rPr>
-        <w:t xml:space="preserve">甲方因乙方违约解除的，赔偿范围为订立合同时可预见的直接损失，不得与违约金重复计算，合计不超过履约保证金金额。未发生实际损失的，不得没收全部保证金。资产按第10.6条、第11.2条、第11.5条处理，不得径行无偿归甲方。</w:t>
+        <w:t xml:space="preserve">甲方据以解除的情形限于：有权机关认定发生重大生产安全责任事故或重大突发环境事件；乙方违法转包、转租；乙方逾期支付承包费或预付款，经书面催告后仍不履行；乙方未按矿安〔2026〕78号完成整改且可归责于乙方。因甲方不配合办理托管或许可导致逾期的，不得适用本条解除。删除以未采完820.65万吨作为解除事由；考核按第6.1条。删除「损失金额在100万元以上」作为单独解除标准。</w:t>
       </w:r>
     </w:p>
     <w:p>
@@ -4735,7 +4804,7 @@
           <w:sz w:val="28"/>
           <w:szCs w:val="28"/>
         </w:rPr>
-        <w:t xml:space="preserve">第12.4条</w:t>
+        <w:t xml:space="preserve">第12.3条</w:t>
       </w:r>
     </w:p>
     <w:p>
@@ -4779,77 +4848,49 @@
           <w:sz w:val="24"/>
           <w:szCs w:val="24"/>
         </w:rPr>
-        <w:t xml:space="preserve">第12.4条　甲方有下列情形之一的，乙方有权解除本协议并要求甲方赔偿乙方的全部直接经济损失：</w:t>
-      </w:r>
-    </w:p>
-    <w:p>
-      <w:pPr>
-        <w:spacing w:after="80"/>
-        <w:jc w:val="left"/>
-      </w:pPr>
-      <w:r>
-        <w:rPr>
-          <w:rFonts w:ascii="Times New Roman" w:eastAsia="宋体" w:hAnsi="Times New Roman"/>
-          <w:sz w:val="24"/>
-          <w:szCs w:val="24"/>
-        </w:rPr>
-        <w:t xml:space="preserve">12.4.1甲方存在严重违约行为，导致乙方无法开展生产经营的。</w:t>
-      </w:r>
-    </w:p>
-    <w:p>
-      <w:pPr>
-        <w:spacing w:after="80"/>
-        <w:jc w:val="left"/>
-      </w:pPr>
-      <w:r>
-        <w:rPr>
-          <w:rFonts w:ascii="Times New Roman" w:eastAsia="宋体" w:hAnsi="Times New Roman"/>
-          <w:sz w:val="24"/>
-          <w:szCs w:val="24"/>
-        </w:rPr>
-        <w:t xml:space="preserve">12.4.2因地质勘察资料存在重大错误、重大遗漏或重大偏差。</w:t>
-      </w:r>
-    </w:p>
-    <w:p>
-      <w:pPr>
-        <w:spacing w:after="80"/>
-        <w:jc w:val="left"/>
-      </w:pPr>
-      <w:r>
-        <w:rPr>
-          <w:rFonts w:ascii="Times New Roman" w:eastAsia="宋体" w:hAnsi="Times New Roman"/>
-          <w:sz w:val="24"/>
-          <w:szCs w:val="24"/>
-        </w:rPr>
-        <w:t xml:space="preserve">12.4.3在乙方未违反合同约定和法律规定的情形下，因甲方原因导致采矿权许可证有效期提前终止的。</w:t>
-      </w:r>
-    </w:p>
-    <w:p>
-      <w:pPr>
-        <w:spacing w:after="80"/>
-        <w:jc w:val="left"/>
-      </w:pPr>
-      <w:r>
-        <w:rPr>
-          <w:rFonts w:ascii="Times New Roman" w:eastAsia="宋体" w:hAnsi="Times New Roman"/>
-          <w:sz w:val="24"/>
-          <w:szCs w:val="24"/>
-        </w:rPr>
-        <w:t xml:space="preserve">12.4.4如因行业主管部门行政职能管理争议原因，经甲方多次协调无法解决，造成矿山停产超过3个月以上的。</w:t>
-      </w:r>
-    </w:p>
-    <w:p>
-      <w:pPr>
-        <w:spacing w:after="80"/>
-        <w:jc w:val="left"/>
-      </w:pPr>
-      <w:r>
-        <w:rPr>
-          <w:rFonts w:ascii="Times New Roman" w:eastAsia="宋体" w:hAnsi="Times New Roman"/>
-          <w:sz w:val="24"/>
-          <w:szCs w:val="24"/>
-        </w:rPr>
-        <w:t xml:space="preserve">12.4.5其他法定或约定的情形。</w:t>
+        <w:t xml:space="preserve">第12.3条　乙方违约导致甲方解除本协议，乙方应同时向甲方承担如下责任：</w:t>
+      </w:r>
+    </w:p>
+    <w:p>
+      <w:pPr>
+        <w:spacing w:after="80"/>
+        <w:jc w:val="left"/>
+      </w:pPr>
+      <w:r>
+        <w:rPr>
+          <w:rFonts w:ascii="Times New Roman" w:eastAsia="宋体" w:hAnsi="Times New Roman"/>
+          <w:sz w:val="24"/>
+          <w:szCs w:val="24"/>
+        </w:rPr>
+        <w:t xml:space="preserve">12.3.1立即退出目标矿权。若因乙方违约导致承包协议解除的，乙方所投资的基础建设和生产设施设备无偿归甲方所有。</w:t>
+      </w:r>
+    </w:p>
+    <w:p>
+      <w:pPr>
+        <w:spacing w:after="80"/>
+        <w:jc w:val="left"/>
+      </w:pPr>
+      <w:r>
+        <w:rPr>
+          <w:rFonts w:ascii="Times New Roman" w:eastAsia="宋体" w:hAnsi="Times New Roman"/>
+          <w:sz w:val="24"/>
+          <w:szCs w:val="24"/>
+        </w:rPr>
+        <w:t xml:space="preserve">12.3.2乙方未依约履行本协议及附件约定义务（职责）的，甲方有权按照其履约保证金（保函）总额的20％要求乙方承担违约金。违约金不足以弥补甲方损失的，甲方有权从履约保证金（保函）中进行扣付。履约保证金（保函）仍不足以弥补甲方损失的，甲方有权要求乙方全额赔偿其实际损失、间接损失、律师费、鉴定费、评估费、诉讼费等各项维权成本和费用。</w:t>
+      </w:r>
+    </w:p>
+    <w:p>
+      <w:pPr>
+        <w:spacing w:after="80"/>
+        <w:jc w:val="left"/>
+      </w:pPr>
+      <w:r>
+        <w:rPr>
+          <w:rFonts w:ascii="Times New Roman" w:eastAsia="宋体" w:hAnsi="Times New Roman"/>
+          <w:sz w:val="24"/>
+          <w:szCs w:val="24"/>
+        </w:rPr>
+        <w:t xml:space="preserve">12.3.3乙方违反本协议及附件约定或法律规定，未按要求整改，导致矿区存在被责令停业整顿或行政处罚风险的，甲方有权按照其履约保证金（保函）总额的30％要求乙方承担违约金。违约金不足以弥补甲方损失的，甲方有权从履约保证金（保函）中进行扣付。履约保证金（保函）仍不足以弥补甲方损失的，甲方有权要求乙方全额赔偿其实际损失、间接损失、律师费、鉴定费、评估费、诉讼费等各项维权成本和费用。</w:t>
       </w:r>
     </w:p>
     <w:p>
@@ -4893,7 +4934,7 @@
           <w:sz w:val="24"/>
           <w:szCs w:val="24"/>
         </w:rPr>
-        <w:t xml:space="preserve">「严重违约」不明。未覆盖擅自停磅、挪用共管账户内乙方资金、因甲方融资查封乙方投入。解除后果只写直接经济损失，未写返还剩余预付款和保证金、附着物评估结算。不得写成甲方支付工程进度款。</w:t>
+        <w:t xml:space="preserve">「风险」即可处30%；20%、30%、无偿接收、间接损失、维权成本叠加，过分高于可预见损失。乙方已付承包费、预付款、保证金并自筹建设，这组条款可以把本金一次收走。</w:t>
       </w:r>
     </w:p>
     <w:p>
@@ -4954,7 +4995,7 @@
           <w:sz w:val="24"/>
           <w:szCs w:val="24"/>
         </w:rPr>
-        <w:t xml:space="preserve">第12.4条</w:t>
+        <w:t xml:space="preserve">第12.3条</w:t>
       </w:r>
     </w:p>
     <w:p>
@@ -4969,7 +5010,7 @@
           <w:sz w:val="24"/>
           <w:szCs w:val="24"/>
         </w:rPr>
-        <w:t xml:space="preserve">有下列情形之一，乙方有权解除，并要求甲方返还剩余预付款及履约保证金、按第11.2条结算附着物、赔偿直接损失：甲方严重违约导致乙方无法生产经营；地质勘察资料存在重大错误、遗漏或偏差；因甲方原因导致采矿许可证有效期提前终止；行政争议经甲方协调仍停产超过3个月；甲方擅自停止过磅、挪用共管账户内乙方资金，经催告后不改正；因甲方融资导致查封、扣押、冻结乙方投入资产或停产、停磅，经催告后不排除妨碍。甲方无向乙方支付工程款或进度款的义务。</w:t>
+        <w:t xml:space="preserve">甲方因乙方违约解除的，赔偿范围为订立合同时可预见的直接损失，不得与违约金重复计算，合计不超过履约保证金金额。未发生实际损失的，不得没收全部保证金。资产按第10.6条、第11.2条、第11.5条处理，不得径行无偿归甲方。</w:t>
       </w:r>
     </w:p>
     <w:p>
@@ -5024,7 +5065,7 @@
           <w:sz w:val="28"/>
           <w:szCs w:val="28"/>
         </w:rPr>
-        <w:t xml:space="preserve">第14.3条</w:t>
+        <w:t xml:space="preserve">第12.4条</w:t>
       </w:r>
     </w:p>
     <w:p>
@@ -5068,7 +5109,77 @@
           <w:sz w:val="24"/>
           <w:szCs w:val="24"/>
         </w:rPr>
-        <w:t xml:space="preserve">第14.3条　遴选公告、招募人要求、遴选文件、乙方的参选承诺及说明作为本协议附件，乙方应予严格遵守。</w:t>
+        <w:t xml:space="preserve">第12.4条　甲方有下列情形之一的，乙方有权解除本协议并要求甲方赔偿乙方的全部直接经济损失：</w:t>
+      </w:r>
+    </w:p>
+    <w:p>
+      <w:pPr>
+        <w:spacing w:after="80"/>
+        <w:jc w:val="left"/>
+      </w:pPr>
+      <w:r>
+        <w:rPr>
+          <w:rFonts w:ascii="Times New Roman" w:eastAsia="宋体" w:hAnsi="Times New Roman"/>
+          <w:sz w:val="24"/>
+          <w:szCs w:val="24"/>
+        </w:rPr>
+        <w:t xml:space="preserve">12.4.1甲方存在严重违约行为，导致乙方无法开展生产经营的。</w:t>
+      </w:r>
+    </w:p>
+    <w:p>
+      <w:pPr>
+        <w:spacing w:after="80"/>
+        <w:jc w:val="left"/>
+      </w:pPr>
+      <w:r>
+        <w:rPr>
+          <w:rFonts w:ascii="Times New Roman" w:eastAsia="宋体" w:hAnsi="Times New Roman"/>
+          <w:sz w:val="24"/>
+          <w:szCs w:val="24"/>
+        </w:rPr>
+        <w:t xml:space="preserve">12.4.2因地质勘察资料存在重大错误、重大遗漏或重大偏差。</w:t>
+      </w:r>
+    </w:p>
+    <w:p>
+      <w:pPr>
+        <w:spacing w:after="80"/>
+        <w:jc w:val="left"/>
+      </w:pPr>
+      <w:r>
+        <w:rPr>
+          <w:rFonts w:ascii="Times New Roman" w:eastAsia="宋体" w:hAnsi="Times New Roman"/>
+          <w:sz w:val="24"/>
+          <w:szCs w:val="24"/>
+        </w:rPr>
+        <w:t xml:space="preserve">12.4.3在乙方未违反合同约定和法律规定的情形下，因甲方原因导致采矿权许可证有效期提前终止的。</w:t>
+      </w:r>
+    </w:p>
+    <w:p>
+      <w:pPr>
+        <w:spacing w:after="80"/>
+        <w:jc w:val="left"/>
+      </w:pPr>
+      <w:r>
+        <w:rPr>
+          <w:rFonts w:ascii="Times New Roman" w:eastAsia="宋体" w:hAnsi="Times New Roman"/>
+          <w:sz w:val="24"/>
+          <w:szCs w:val="24"/>
+        </w:rPr>
+        <w:t xml:space="preserve">12.4.4如因行业主管部门行政职能管理争议原因，经甲方多次协调无法解决，造成矿山停产超过3个月以上的。</w:t>
+      </w:r>
+    </w:p>
+    <w:p>
+      <w:pPr>
+        <w:spacing w:after="80"/>
+        <w:jc w:val="left"/>
+      </w:pPr>
+      <w:r>
+        <w:rPr>
+          <w:rFonts w:ascii="Times New Roman" w:eastAsia="宋体" w:hAnsi="Times New Roman"/>
+          <w:sz w:val="24"/>
+          <w:szCs w:val="24"/>
+        </w:rPr>
+        <w:t xml:space="preserve">12.4.5其他法定或约定的情形。</w:t>
       </w:r>
     </w:p>
     <w:p>
@@ -5112,7 +5223,7 @@
           <w:sz w:val="24"/>
           <w:szCs w:val="24"/>
         </w:rPr>
-        <w:t xml:space="preserve">《招募人要求》部分条款严于本定稿（如手续费全部由承包方承担）。若附件优先，已谈成的第2.5条等核心利益被架空。</w:t>
+        <w:t xml:space="preserve">「严重违约」不明。未覆盖擅自停磅、挪用共管账户内乙方资金、因甲方融资查封乙方投入。解除后果只写直接经济损失，未写返还剩余预付款和保证金、附着物评估结算。不得写成甲方支付工程进度款。</w:t>
       </w:r>
     </w:p>
     <w:p>
@@ -5173,7 +5284,7 @@
           <w:sz w:val="24"/>
           <w:szCs w:val="24"/>
         </w:rPr>
-        <w:t xml:space="preserve">第14.3条</w:t>
+        <w:t xml:space="preserve">第12.4条</w:t>
       </w:r>
     </w:p>
     <w:p>
@@ -5188,7 +5299,7 @@
           <w:sz w:val="24"/>
           <w:szCs w:val="24"/>
         </w:rPr>
-        <w:t xml:space="preserve">遴选公告、招募人要求、遴选文件、乙方的参选承诺及说明作为本协议附件。附件与本协议正文不一致的，以本协议正文为准。</w:t>
+        <w:t xml:space="preserve">有下列情形之一，乙方有权解除，并要求甲方返还剩余预付款及履约保证金、按第11.2条结算附着物、赔偿直接损失：甲方严重违约导致乙方无法生产经营；地质勘察资料存在重大错误、遗漏或偏差；因甲方原因导致采矿许可证有效期提前终止；行政争议经甲方协调仍停产超过3个月；甲方擅自停止过磅、挪用共管账户内乙方资金，经催告后不改正；因甲方融资导致查封、扣押、冻结乙方投入资产或停产、停磅，经催告后不排除妨碍。甲方无向乙方支付工程款或进度款的义务。</w:t>
       </w:r>
     </w:p>
     <w:p>
@@ -5233,6 +5344,225 @@
     </w:p>
     <w:p>
       <w:pPr>
+        <w:spacing w:after="140" w:before="320"/>
+      </w:pPr>
+      <w:r>
+        <w:rPr>
+          <w:rFonts w:ascii="Arial" w:eastAsia="黑体" w:hAnsi="Arial"/>
+          <w:b/>
+          <w:bCs/>
+          <w:sz w:val="28"/>
+          <w:szCs w:val="28"/>
+        </w:rPr>
+        <w:t xml:space="preserve">第14.3条</w:t>
+      </w:r>
+    </w:p>
+    <w:p>
+      <w:pPr>
+        <w:spacing w:after="80"/>
+        <w:jc w:val="left"/>
+      </w:pPr>
+      <w:r>
+        <w:rPr>
+          <w:rFonts w:ascii="Times New Roman" w:eastAsia="宋体" w:hAnsi="Times New Roman"/>
+          <w:sz w:val="24"/>
+          <w:szCs w:val="24"/>
+        </w:rPr>
+        <w:t xml:space="preserve"> </w:t>
+      </w:r>
+    </w:p>
+    <w:p>
+      <w:pPr>
+        <w:spacing w:after="60" w:before="160"/>
+      </w:pPr>
+      <w:r>
+        <w:rPr>
+          <w:rFonts w:ascii="Arial" w:eastAsia="黑体" w:hAnsi="Arial"/>
+          <w:b/>
+          <w:bCs/>
+          <w:color w:val="1F4E79"/>
+          <w:sz w:val="22"/>
+          <w:szCs w:val="22"/>
+        </w:rPr>
+        <w:t xml:space="preserve">原文规定</w:t>
+      </w:r>
+    </w:p>
+    <w:p>
+      <w:pPr>
+        <w:spacing w:after="80"/>
+        <w:jc w:val="left"/>
+      </w:pPr>
+      <w:r>
+        <w:rPr>
+          <w:rFonts w:ascii="Times New Roman" w:eastAsia="宋体" w:hAnsi="Times New Roman"/>
+          <w:sz w:val="24"/>
+          <w:szCs w:val="24"/>
+        </w:rPr>
+        <w:t xml:space="preserve">第14.3条　遴选公告、招募人要求、遴选文件、乙方的参选承诺及说明作为本协议附件，乙方应予严格遵守。</w:t>
+      </w:r>
+    </w:p>
+    <w:p>
+      <w:pPr>
+        <w:spacing w:after="80"/>
+        <w:jc w:val="left"/>
+      </w:pPr>
+      <w:r>
+        <w:rPr>
+          <w:rFonts w:ascii="Times New Roman" w:eastAsia="宋体" w:hAnsi="Times New Roman"/>
+          <w:sz w:val="24"/>
+          <w:szCs w:val="24"/>
+        </w:rPr>
+        <w:t xml:space="preserve"> </w:t>
+      </w:r>
+    </w:p>
+    <w:p>
+      <w:pPr>
+        <w:spacing w:after="60" w:before="160"/>
+      </w:pPr>
+      <w:r>
+        <w:rPr>
+          <w:rFonts w:ascii="Arial" w:eastAsia="黑体" w:hAnsi="Arial"/>
+          <w:b/>
+          <w:bCs/>
+          <w:color w:val="1F4E79"/>
+          <w:sz w:val="22"/>
+          <w:szCs w:val="22"/>
+        </w:rPr>
+        <w:t xml:space="preserve">风险点</w:t>
+      </w:r>
+    </w:p>
+    <w:p>
+      <w:pPr>
+        <w:spacing w:after="80"/>
+        <w:jc w:val="left"/>
+      </w:pPr>
+      <w:r>
+        <w:rPr>
+          <w:rFonts w:ascii="Times New Roman" w:eastAsia="宋体" w:hAnsi="Times New Roman"/>
+          <w:sz w:val="24"/>
+          <w:szCs w:val="24"/>
+        </w:rPr>
+        <w:t xml:space="preserve">《招募人要求》部分条款严于本定稿（如手续费全部由承包方承担）。若附件优先，已谈成的第2.5条等核心利益被架空。</w:t>
+      </w:r>
+    </w:p>
+    <w:p>
+      <w:pPr>
+        <w:spacing w:after="80"/>
+        <w:jc w:val="left"/>
+      </w:pPr>
+      <w:r>
+        <w:rPr>
+          <w:rFonts w:ascii="Times New Roman" w:eastAsia="宋体" w:hAnsi="Times New Roman"/>
+          <w:sz w:val="24"/>
+          <w:szCs w:val="24"/>
+        </w:rPr>
+        <w:t xml:space="preserve"> </w:t>
+      </w:r>
+    </w:p>
+    <w:p>
+      <w:pPr>
+        <w:spacing w:after="60" w:before="160"/>
+      </w:pPr>
+      <w:r>
+        <w:rPr>
+          <w:rFonts w:ascii="Arial" w:eastAsia="黑体" w:hAnsi="Arial"/>
+          <w:b/>
+          <w:bCs/>
+          <w:color w:val="1F4E79"/>
+          <w:sz w:val="22"/>
+          <w:szCs w:val="22"/>
+        </w:rPr>
+        <w:t xml:space="preserve">修改后条文</w:t>
+      </w:r>
+    </w:p>
+    <w:p>
+      <w:pPr>
+        <w:spacing w:after="80"/>
+        <w:jc w:val="left"/>
+      </w:pPr>
+      <w:r>
+        <w:rPr>
+          <w:rFonts w:ascii="Times New Roman" w:eastAsia="宋体" w:hAnsi="Times New Roman"/>
+          <w:sz w:val="24"/>
+          <w:szCs w:val="24"/>
+        </w:rPr>
+        <w:t xml:space="preserve"> </w:t>
+      </w:r>
+    </w:p>
+    <w:p>
+      <w:pPr>
+        <w:shd w:fill="F4F7FB" w:val="clear"/>
+        <w:spacing w:after="80"/>
+        <w:ind w:left="360"/>
+      </w:pPr>
+      <w:r>
+        <w:rPr>
+          <w:rFonts w:ascii="Times New Roman" w:eastAsia="宋体" w:hAnsi="Times New Roman"/>
+          <w:b/>
+          <w:bCs/>
+          <w:sz w:val="24"/>
+          <w:szCs w:val="24"/>
+        </w:rPr>
+        <w:t xml:space="preserve">第14.3条</w:t>
+      </w:r>
+    </w:p>
+    <w:p>
+      <w:pPr>
+        <w:shd w:fill="F4F7FB" w:val="clear"/>
+        <w:spacing w:after="80"/>
+        <w:ind w:left="360"/>
+      </w:pPr>
+      <w:r>
+        <w:rPr>
+          <w:rFonts w:ascii="Times New Roman" w:eastAsia="宋体" w:hAnsi="Times New Roman"/>
+          <w:sz w:val="24"/>
+          <w:szCs w:val="24"/>
+        </w:rPr>
+        <w:t xml:space="preserve">遴选公告、招募人要求、遴选文件、乙方的参选承诺及说明、已签订的《联合体协议书》作为本协议附件。附件与本协议正文不一致的，以本协议正文为准。联合体成员分工以第10.12条为准。</w:t>
+      </w:r>
+    </w:p>
+    <w:p>
+      <w:pPr>
+        <w:spacing w:after="80"/>
+        <w:jc w:val="left"/>
+      </w:pPr>
+      <w:r>
+        <w:rPr>
+          <w:rFonts w:ascii="Times New Roman" w:eastAsia="宋体" w:hAnsi="Times New Roman"/>
+          <w:sz w:val="24"/>
+          <w:szCs w:val="24"/>
+        </w:rPr>
+        <w:t xml:space="preserve"> </w:t>
+      </w:r>
+    </w:p>
+    <w:p>
+      <w:pPr>
+        <w:spacing w:after="80"/>
+      </w:pPr>
+      <w:r>
+        <w:rPr>
+          <w:sz w:val="8"/>
+          <w:szCs w:val="8"/>
+        </w:rPr>
+        <w:t xml:space="preserve"> </w:t>
+      </w:r>
+    </w:p>
+    <w:p>
+      <w:pPr>
+        <w:spacing w:after="80"/>
+        <w:jc w:val="left"/>
+      </w:pPr>
+      <w:r>
+        <w:rPr>
+          <w:rFonts w:ascii="Times New Roman" w:eastAsia="宋体" w:hAnsi="Times New Roman"/>
+          <w:sz w:val="24"/>
+          <w:szCs w:val="24"/>
+        </w:rPr>
+        <w:t xml:space="preserve"> </w:t>
+      </w:r>
+    </w:p>
+    <w:p>
+      <w:pPr>
         <w:spacing w:after="200" w:before="360"/>
         <w:jc w:val="center"/>
       </w:pPr>
@@ -5272,7 +5602,35 @@
           <w:sz w:val="24"/>
           <w:szCs w:val="24"/>
         </w:rPr>
-        <w:t xml:space="preserve">仅作参考，不提修改意见。</w:t>
+        <w:t xml:space="preserve">已盖章，不提修改意见，不改该协议文本。</w:t>
+      </w:r>
+    </w:p>
+    <w:p>
+      <w:pPr>
+        <w:spacing w:after="80"/>
+        <w:jc w:val="left"/>
+      </w:pPr>
+      <w:r>
+        <w:rPr>
+          <w:rFonts w:ascii="Times New Roman" w:eastAsia="宋体" w:hAnsi="Times New Roman"/>
+          <w:sz w:val="24"/>
+          <w:szCs w:val="24"/>
+        </w:rPr>
+        <w:t xml:space="preserve"> </w:t>
+      </w:r>
+    </w:p>
+    <w:p>
+      <w:pPr>
+        <w:spacing w:after="80"/>
+        <w:jc w:val="left"/>
+      </w:pPr>
+      <w:r>
+        <w:rPr>
+          <w:rFonts w:ascii="Times New Roman" w:eastAsia="宋体" w:hAnsi="Times New Roman"/>
+          <w:sz w:val="24"/>
+          <w:szCs w:val="24"/>
+        </w:rPr>
+        <w:t xml:space="preserve">该协议第三条为对招募人连带责任；第四条已列明三家分工（天木：对外联络、账户资金、销售及协助融资；德晟：剥离、开采、转运及设备人员；宏祥：爆破）。承包协议书第10.12条原文未写入该分工，本次在第一部分第10.12条、第1.3条中订入，使承包合同与已签订联合体协议一致。</w:t>
       </w:r>
     </w:p>
     <w:p>
@@ -5525,7 +5883,7 @@
           <w:sz w:val="24"/>
           <w:szCs w:val="24"/>
         </w:rPr>
-        <w:t xml:space="preserve">5. 本协议与承包协议书第1.3条、第2.7条、第10.12条、中选联合体身份直接冲突。矿安〔2026〕78号查处挂靠，2028年5月1日后可责令停产。</w:t>
+        <w:t xml:space="preserve">5. 本协议与已签订《联合体协议书》第四条（德晟实施剥离、开采、转运，宏祥实施爆破）、承包协议书第1.3条、第10.12条、中选联合体身份直接冲突。矿安〔2026〕78号查处挂靠，2028年5月1日后可责令停产。</w:t>
       </w:r>
     </w:p>
     <w:p>
@@ -6099,7 +6457,7 @@
           <w:sz w:val="24"/>
           <w:szCs w:val="24"/>
         </w:rPr>
-        <w:t xml:space="preserve">甲乙双方作为中选联合体成员，共同履行与湖南润鑫矿业有限公司（以下简称「润鑫」）签订的承包协议书。甲方为牵头人，负责按附件《出资计划》投入资金，负责经营协调和产品销售，并承担联合体对润鑫的全部付款。甲方不得自行组织采掘（剥）或爆破。</w:t>
+        <w:t xml:space="preserve">甲乙双方作为中选联合体成员，共同履行与湖南润鑫矿业有限公司（以下简称「润鑫」）签订的承包协议书。内部职责以已签订《联合体协议书》第四条及承包协议书第10.12条为准。甲方为牵头人，负责按附件《出资计划》投入资金，负责经营协调和产品销售，并承担联合体对润鑫的全部付款。甲方不得自行组织采掘（剥）或爆破。</w:t>
       </w:r>
     </w:p>
     <w:p>
@@ -12337,35 +12695,35 @@
           <w:sz w:val="24"/>
           <w:szCs w:val="24"/>
         </w:rPr>
-        <w:t xml:space="preserve">《承包协议书》定稿  ｜  第一部分。矿权承包：乙方付费、甲方收费、甲方无工程款义务。只改重大利益和核心条款，逐条列出序号、原文、风险点、修改后条文。第4.2条第（8）项融资为甲方自身需求，与本项目建设无关，只隔离乙方风险并由甲方承担全部融资责任。</w:t>
-      </w:r>
-    </w:p>
-    <w:p>
-      <w:pPr>
-        <w:spacing w:after="80"/>
-        <w:jc w:val="left"/>
-      </w:pPr>
-      <w:r>
-        <w:rPr>
-          <w:rFonts w:ascii="Times New Roman" w:eastAsia="宋体" w:hAnsi="Times New Roman"/>
-          <w:sz w:val="24"/>
-          <w:szCs w:val="24"/>
-        </w:rPr>
-        <w:t xml:space="preserve">已盖章联合体协议书  ｜  仅参考，不提修改。</w:t>
-      </w:r>
-    </w:p>
-    <w:p>
-      <w:pPr>
-        <w:spacing w:after="80"/>
-        <w:jc w:val="left"/>
-      </w:pPr>
-      <w:r>
-        <w:rPr>
-          <w:rFonts w:ascii="Times New Roman" w:eastAsia="宋体" w:hAnsi="Times New Roman"/>
-          <w:sz w:val="24"/>
-          <w:szCs w:val="24"/>
-        </w:rPr>
-        <w:t xml:space="preserve">《联合体内部合作协议》  ｜  第三部分。先总体违法，再逐条修改。对润鑫的付款由天木承担；废除资质费和业主工程款划转；德晟不为润鑫或天木融资担保。不接受改成真实实施的，德晟不应签署。</w:t>
+        <w:t xml:space="preserve">《承包协议书》定稿  ｜  第一部分。矿权承包：乙方付费、甲方收费、甲方无工程款义务。已签订《联合体协议书》第四条分工未写入本合同，订入第10.12条，并与第1.3条对齐。第4.2条第（8）项融资为甲方自身需求，与本项目建设无关。</w:t>
+      </w:r>
+    </w:p>
+    <w:p>
+      <w:pPr>
+        <w:spacing w:after="80"/>
+        <w:jc w:val="left"/>
+      </w:pPr>
+      <w:r>
+        <w:rPr>
+          <w:rFonts w:ascii="Times New Roman" w:eastAsia="宋体" w:hAnsi="Times New Roman"/>
+          <w:sz w:val="24"/>
+          <w:szCs w:val="24"/>
+        </w:rPr>
+        <w:t xml:space="preserve">已盖章联合体协议书  ｜  不改文本。第四条分工作为承包合同第10.12条订入依据。</w:t>
+      </w:r>
+    </w:p>
+    <w:p>
+      <w:pPr>
+        <w:spacing w:after="80"/>
+        <w:jc w:val="left"/>
+      </w:pPr>
+      <w:r>
+        <w:rPr>
+          <w:rFonts w:ascii="Times New Roman" w:eastAsia="宋体" w:hAnsi="Times New Roman"/>
+          <w:sz w:val="24"/>
+          <w:szCs w:val="24"/>
+        </w:rPr>
+        <w:t xml:space="preserve">《联合体内部合作协议》  ｜  第三部分。先总体违法，再逐条修改。对内安排须与已签订《联合体协议书》第四条、承包合同第10.12条一致。不接受改成真实实施的，德晟不应签署。</w:t>
       </w:r>
     </w:p>
     <w:p>

</xml_diff>

<commit_message>
Limit recruiter money claims to Tianmu only.
Contract payments, prepaid amounts, the bond and the escrow sit with
Tianmu. Runxin cannot claim those debts from Desheng or Hongxiang.
Desheng and Hongxiang are liable only within their signed work splits.

Co-authored-by: Jett Wang <jamiesun@users.noreply.github.com>
</commit_message>
<xml_diff>
--- a/deliverables/desheng-clause-redline.docx
+++ b/deliverables/desheng-clause-redline.docx
@@ -103,7 +103,7 @@
           <w:sz w:val="24"/>
           <w:szCs w:val="24"/>
         </w:rPr>
-        <w:t xml:space="preserve">：从承包人（中选联合体）整体利益出发，只改重大利益和核心条款。对甲方仍为一体连带。已签订《联合体协议书》第四条的成员分工未写入本合同的，应订入第10.12条，并与第1.3条实际实施对齐。防挂靠的对内费用、追偿仍放在《联合体内部合作协议》，不把资质费订入承包合同。</w:t>
+        <w:t xml:space="preserve">：从承包人（中选联合体）整体利益出发，只改重大利益和核心条款。已签订《联合体协议书》第四条分工订入第10.12条。本合同项下各项资金的支付义务专属于乙方一（天木），甲方无权就该等金钱债务向乙方二、乙方三主张；乙方二、乙方三仅对各自职责范围内的分工内容承担法律责任。防挂靠的对内费用、追偿仍放在《联合体内部合作协议》。</w:t>
       </w:r>
     </w:p>
     <w:p>
@@ -2058,7 +2058,7 @@
           <w:sz w:val="24"/>
           <w:szCs w:val="24"/>
         </w:rPr>
-        <w:t xml:space="preserve">本协议签订后15日内开设基建共管账户。乙方存入人民币1200万元，为乙方自有建设资金，专项用于矿区基建、道路及配套，双签支取。按施工进度拨付至乙方，性质为乙方支用己方资金，不构成甲方向乙方付款。补足以双方书面确认的建设预算为限。乙方提交支取申请后，甲方应在5个工作日内确认并配合办理；逾期确认的，建设期顺延。监理单位由双方协商确定；监理费从共管账户列支的，预算应事先书面确认。农民工工资专用账户同步开设。竣工验收合格并完成质保金安排后解除共管。</w:t>
+        <w:t xml:space="preserve">本协议签订后15日内开设基建共管账户。由乙方一存入人民币1200万元，为承包方建设资金，专项用于矿区基建、道路及配套，双签支取。按施工进度拨付至实际实施建设的联合体成员，性质为支用己方建设资金，不构成甲方向承包方付款。缴存、补足义务专属于乙方一，甲方不得要求乙方二、乙方三缴存、补足或就该账户资金承担连带。补足以双方书面确认的建设预算为限。支取申请提交后，甲方应在5个工作日内确认并配合办理；逾期确认的，建设期顺延。监理单位由双方协商确定；监理费从共管账户列支的，预算应事先书面确认。农民工工资专用账户同步开设。竣工验收合格并完成质保金安排后解除共管。</w:t>
       </w:r>
     </w:p>
     <w:p>
@@ -2496,7 +2496,7 @@
           <w:sz w:val="24"/>
           <w:szCs w:val="24"/>
         </w:rPr>
-        <w:t xml:space="preserve">预付款按过磅吨数和约定单价抵扣。余额不足100万元时，甲方应书面通知乙方，乙方在收到通知后10个工作日内补足不少于500万元。因甲方对账错误或计量系统故障停止过磅的，应立即恢复，并顺延受影响的期限。</w:t>
+        <w:t xml:space="preserve">预付款按过磅吨数和约定单价抵扣。余额不足100万元时，甲方应书面通知乙方一，乙方一在收到通知后10个工作日内补足不少于500万元。因甲方对账错误或计量系统故障停止过磅的，应立即恢复，并顺延受影响的期限。预付款的缴存、补足义务专属于乙方一，甲方不得向乙方二、乙方三主张。</w:t>
       </w:r>
     </w:p>
     <w:p>
@@ -2715,7 +2715,7 @@
           <w:sz w:val="24"/>
           <w:szCs w:val="24"/>
         </w:rPr>
-        <w:t xml:space="preserve">乙方未按约定支付承包费的，甲方应书面催告，给予不少于10个工作日的宽限期。宽限期满仍未支付的，甲方可以暂停过磅；仍不履行的，可以解除本协议。</w:t>
+        <w:t xml:space="preserve">乙方一未按约定支付承包费的，甲方应书面催告乙方一，给予不少于10个工作日的宽限期。宽限期满仍未支付的，甲方可以暂停过磅；仍不履行的，可以解除本协议。甲方就承包费、预付款、履约保证金及共管资金等金钱给付，仅得向乙方一主张，无权责令乙方二、乙方三代为支付或承担连带。</w:t>
       </w:r>
     </w:p>
     <w:p>
@@ -3105,25 +3105,7 @@
           <w:sz w:val="24"/>
           <w:szCs w:val="24"/>
         </w:rPr>
-        <w:t xml:space="preserve">已签订《联合体协议书》第三条、第四条已写明连带责任和三家分工：乙方一（天木）对外联络、资金账户、销售及协助融资；乙方二（德晟）实施剥离、开采、转运并提供设备人员；乙方三（宏祥）实施爆破。承包协议书仅列联合体名称和牵头人，第2.6条、第4.2条一律写「乙方」，</w:t>
-      </w:r>
-      <w:r>
-        <w:rPr>
-          <w:rFonts w:ascii="Times New Roman" w:eastAsia="宋体" w:hAnsi="Times New Roman"/>
-          <w:b/>
-          <w:bCs/>
-          <w:sz w:val="24"/>
-          <w:szCs w:val="24"/>
-        </w:rPr>
-        <w:t xml:space="preserve">未将上述分工订入本合同</w:t>
-      </w:r>
-      <w:r>
-        <w:rPr>
-          <w:rFonts w:ascii="Times New Roman" w:eastAsia="宋体" w:hAnsi="Times New Roman"/>
-          <w:sz w:val="24"/>
-          <w:szCs w:val="24"/>
-        </w:rPr>
-        <w:t xml:space="preserve">。结果是：对甲方仍可向三家连带主张，合同正文却看不出谁实际采掘、谁实际爆破，与《联合体协议书》第四条、第1.3条及矿安〔2026〕78号要求的实际实施脱节。「甲方只对牵头单位主张全部权利」不能约束第三人，却可能导致停磅、解除、退还预付款和保证金只送达牵头人。</w:t>
+        <w:t xml:space="preserve">已签订《联合体协议书》第四条已分工，第三条却对招募人概括连带。承包协议书第10.12条原文同时写「甲方只对牵头单位主张全部权利」和第（1）项连带，相互矛盾。若不限缩，甲方可就承包费、预付款、履约保证金、共管1200万元向德晟、宏祥追索，也可把销售、融资、欠费违约算到采掘、爆破头上。金钱给付应专属于乙方一（天木）；乙方二、乙方三仅对各自职责范围承担责任。须在正文写明，并优先于《联合体协议书》第三条。法律关于安全生产事故对第三人的强制性连带、出借资质的连带，不能以本条排除，风险点须向德晟说明。</w:t>
       </w:r>
     </w:p>
     <w:p>
@@ -3214,7 +3196,7 @@
           <w:sz w:val="24"/>
           <w:szCs w:val="24"/>
         </w:rPr>
-        <w:t xml:space="preserve">（1）内部职责划分不削弱对甲方的义务。牵头人签署、处理的事项，联合体各成员均予承认。任一成员未履行或未完全履行的，甲方有权要求联合体成员承担连带责任。删除「甲方只对此牵头单位主张全部权利」。</w:t>
+        <w:t xml:space="preserve">（1）资金支付义务专属。本合同项下应由承包方支付的全部款项，包括承包费（含矿业权使用费、矿权租赁费）、预付款、履约保证金（或保函费用）、第5.1条基建共管资金的缴存与补足、第4.2条第（6）项村补、第5.2.2条生态修复专账中应由承包方缴纳的部分，以及其他金钱给付，付款义务人仅为乙方一。乙方二、乙方三对该等金钱债务不承担支付、连带、补充或担保责任。甲方就上述金钱债权仅有权向乙方一主张，无权向乙方二、乙方三主张，亦不得以该等债务扣留、抵销、查封乙方二、乙方三投入的设备、机具及工资、施工费用。</w:t>
       </w:r>
     </w:p>
     <w:p>
@@ -3229,7 +3211,7 @@
           <w:sz w:val="24"/>
           <w:szCs w:val="24"/>
         </w:rPr>
-        <w:t xml:space="preserve">（2）付款催告、停磅、解除及预付款、保证金的退还，应向乙方作出；仅送达牵头人的，对未收到通知的成员不发生该等意思表示的效力，但法律另有规定的除外。</w:t>
+        <w:t xml:space="preserve">（2）法律责任限于分工。除法律强制性规定外：乙方一仅对其第（4）项第1目职责及前款金钱给付承担责任；乙方二仅对其第（4）项第2目职责范围内的剥离、开采、转运及现场施工过错承担法律责任，不对销售、资金缴存、融资、承包费及预付款违约承担责任；乙方三仅对其第（4）项第3目职责范围内的爆破作业过错承担法律责任，不对前款所列金钱债务及其他成员的施工、销售承担责任。甲方不得因乙方一欠费、销售、融资或乙方三爆破事项，向乙方二主张超出其分工范围的责任；亦不得因乙方一欠费、销售、融资或乙方二采掘事项，向乙方三主张超出其分工范围的责任。</w:t>
       </w:r>
     </w:p>
     <w:p>
@@ -3244,7 +3226,7 @@
           <w:sz w:val="24"/>
           <w:szCs w:val="24"/>
         </w:rPr>
-        <w:t xml:space="preserve">（3）成员单位和职责变更，须符合法律法规及遴选要求，并书面报告经甲方同意。</w:t>
+        <w:t xml:space="preserve">（3）牵头人对外联络、文件递交及日常协调，不改变第（1）（2）项。成员单位和职责变更，须符合法律法规及遴选要求，并书面报告经甲方同意。</w:t>
       </w:r>
     </w:p>
     <w:p>
@@ -3259,25 +3241,7 @@
           <w:sz w:val="24"/>
           <w:szCs w:val="24"/>
         </w:rPr>
-        <w:t xml:space="preserve">（4）联合体内部职责分工以已签订《联合体协议书》第四条为准，并作为本合同对内履约安排。各成员应按下列分工</w:t>
-      </w:r>
-      <w:r>
-        <w:rPr>
-          <w:rFonts w:ascii="Times New Roman" w:eastAsia="宋体" w:hAnsi="Times New Roman"/>
-          <w:b/>
-          <w:bCs/>
-          <w:sz w:val="24"/>
-          <w:szCs w:val="24"/>
-        </w:rPr>
-        <w:t xml:space="preserve">实际实施</w:t>
-      </w:r>
-      <w:r>
-        <w:rPr>
-          <w:rFonts w:ascii="Times New Roman" w:eastAsia="宋体" w:hAnsi="Times New Roman"/>
-          <w:sz w:val="24"/>
-          <w:szCs w:val="24"/>
-        </w:rPr>
-        <w:t xml:space="preserve">，不得仅提供资质、许可证而不实施：</w:t>
+        <w:t xml:space="preserve">（4）联合体内部职责分工以已签订《联合体协议书》第四条为准，各成员应按下列分工实际实施，不得仅提供资质、许可证而不实施：</w:t>
       </w:r>
     </w:p>
     <w:p>
@@ -3292,7 +3256,7 @@
           <w:sz w:val="24"/>
           <w:szCs w:val="24"/>
         </w:rPr>
-        <w:t xml:space="preserve">1. 乙方一（湖南天木环保科技有限公司）：统一对接甲方，负责文件递交、合同签署及日常联络；协调开设基建共管账户、生态修复及安全保障等专项账户，负责基建资金及履约保证金的缴存，资金支付实行双签，负责预付款衔接及账户余额补足中应由承包方履行的部分；负责石子料、机制砂销售、客户开拓及物流，对销售价格真实性负责；按第4.2条第（8）项配合甲方自身融资（融资资金进入甲方账户），不以乙方二、乙方三为借款人、保证人或出质人；承担绿色矿山、安全评价、环境影响评价等手续中约定由承包方承担的费用，负责镇村属地日常协调并承担《联合体协议书》约定的相关补偿，承担遴选过程第三方服务费用。</w:t>
+        <w:t xml:space="preserve">1. 乙方一（湖南天木环保科技有限公司）：统一对接甲方，负责文件递交、合同签署及日常联络；协调开设基建共管账户、生态修复及安全保障等专项账户，负责本条项下全部资金的缴存、补足与结算；负责石子料、机制砂销售、客户开拓及物流，对销售价格真实性负责；按第4.2条第（8）项配合甲方自身融资（融资资金进入甲方账户），不以乙方二、乙方三为借款人、保证人或出质人；承担绿色矿山、安全评价、环境影响评价等手续中约定由承包方承担的费用，负责镇村属地日常协调并承担《联合体协议书》约定的相关补偿，承担遴选过程第三方服务费用。</w:t>
       </w:r>
     </w:p>
     <w:p>
@@ -3337,7 +3301,22 @@
           <w:sz w:val="24"/>
           <w:szCs w:val="24"/>
         </w:rPr>
-        <w:t xml:space="preserve">（5）前款分工为履约安排，不免除第（1）项连带责任，也不能对抗甲方。与《联合体协议书》第四条文字不一致的，以本款为准；本款未列明的，适用《联合体协议书》第四条。</w:t>
+        <w:t xml:space="preserve">（5）金钱给付的催告、停磅、因欠费解除，应向乙方一作出。涉及乙方二施工或乙方三爆破的整改、暂停作业，应同时书面通知该成员。仅送达牵头人而不通知该成员的，对该成员不发生该等意思表示的效力，但法律另有规定的除外。</w:t>
+      </w:r>
+    </w:p>
+    <w:p>
+      <w:pPr>
+        <w:shd w:fill="F4F7FB" w:val="clear"/>
+        <w:spacing w:after="80"/>
+        <w:ind w:left="360"/>
+      </w:pPr>
+      <w:r>
+        <w:rPr>
+          <w:rFonts w:ascii="Times New Roman" w:eastAsia="宋体" w:hAnsi="Times New Roman"/>
+          <w:sz w:val="24"/>
+          <w:szCs w:val="24"/>
+        </w:rPr>
+        <w:t xml:space="preserve">（6）本条与《联合体协议书》第三条关于对招募人连带责任的约定不一致的，就本合同项下金钱给付及超出各自职责范围的责任，以本条为准。本条未列明的分工内容，适用《联合体协议书》第四条。法律关于安全生产、生态环境及出借资质的强制性规定除外。</w:t>
       </w:r>
     </w:p>
     <w:p>
@@ -4749,7 +4728,7 @@
           <w:sz w:val="24"/>
           <w:szCs w:val="24"/>
         </w:rPr>
-        <w:t xml:space="preserve">甲方据以解除的情形限于：有权机关认定发生重大生产安全责任事故或重大突发环境事件；乙方违法转包、转租；乙方逾期支付承包费或预付款，经书面催告后仍不履行；乙方未按矿安〔2026〕78号完成整改且可归责于乙方。因甲方不配合办理托管或许可导致逾期的，不得适用本条解除。删除以未采完820.65万吨作为解除事由；考核按第6.1条。删除「损失金额在100万元以上」作为单独解除标准。</w:t>
+        <w:t xml:space="preserve">甲方据以解除的情形限于：有权机关认定发生重大生产安全责任事故或重大突发环境事件；违法转包、转租；乙方一逾期支付承包费或预付款，经书面催告后仍不履行；未按矿安〔2026〕78号完成整改且可归责于相应责任成员。因欠费解除的，甲方仅得向乙方一主张第12.3条项下金钱责任，不得向乙方二、乙方三主张。因甲方不配合办理托管或许可导致逾期的，不得适用本条解除。删除以未采完820.65万吨作为解除事由；考核按第6.1条。删除「损失金额在100万元以上」作为单独解除标准。</w:t>
       </w:r>
     </w:p>
     <w:p>
@@ -5010,7 +4989,7 @@
           <w:sz w:val="24"/>
           <w:szCs w:val="24"/>
         </w:rPr>
-        <w:t xml:space="preserve">甲方因乙方违约解除的，赔偿范围为订立合同时可预见的直接损失，不得与违约金重复计算，合计不超过履约保证金金额。未发生实际损失的，不得没收全部保证金。资产按第10.6条、第11.2条、第11.5条处理，不得径行无偿归甲方。</w:t>
+        <w:t xml:space="preserve">甲方因违约解除的，金钱赔偿及违约金仅得向应承担责任的成员主张：因欠付承包费、预付款、保证金解除的，仅得向乙方一主张。赔偿范围为订立合同时可预见的直接损失，不得与违约金重复计算，合计不超过履约保证金金额。未发生实际损失的，不得没收全部保证金。资产按第10.6条、第11.2条、第11.5条处理，不得径行无偿归甲方。不得以乙方一的金钱债务扣留乙方二、乙方三的可移动设备。</w:t>
       </w:r>
     </w:p>
     <w:p>
@@ -5518,7 +5497,7 @@
           <w:sz w:val="24"/>
           <w:szCs w:val="24"/>
         </w:rPr>
-        <w:t xml:space="preserve">遴选公告、招募人要求、遴选文件、乙方的参选承诺及说明、已签订的《联合体协议书》作为本协议附件。附件与本协议正文不一致的，以本协议正文为准。联合体成员分工以第10.12条为准。</w:t>
+        <w:t xml:space="preserve">遴选公告、招募人要求、遴选文件、乙方的参选承诺及说明、已签订的《联合体协议书》作为本协议附件。附件与本协议正文不一致的，以本协议正文为准。联合体成员分工、资金支付义务人及责任范围以第10.12条为准；与《联合体协议书》第三条不一致的，就金钱给付及超出各自职责范围的责任，以第10.12条为准。</w:t>
       </w:r>
     </w:p>
     <w:p>
@@ -5630,7 +5609,7 @@
           <w:sz w:val="24"/>
           <w:szCs w:val="24"/>
         </w:rPr>
-        <w:t xml:space="preserve">该协议第三条为对招募人连带责任；第四条已列明三家分工（天木：对外联络、账户资金、销售及协助融资；德晟：剥离、开采、转运及设备人员；宏祥：爆破）。承包协议书第10.12条原文未写入该分工，本次在第一部分第10.12条、第1.3条中订入，使承包合同与已签订联合体协议一致。</w:t>
+        <w:t xml:space="preserve">该协议第三条为对招募人概括连带；第四条已列明三家分工。承包协议书须在第10.12条订入分工，并写明：金钱给付专属天木，甲方不得向德晟、宏祥主张；德晟、宏祥仅对各自职责范围承担责任。该协议本身已盖章，不改文本；与承包合同正文冲突的，按第14.3条以承包合同第10.12条为准。</w:t>
       </w:r>
     </w:p>
     <w:p>
@@ -6989,7 +6968,7 @@
           <w:sz w:val="24"/>
           <w:szCs w:val="24"/>
         </w:rPr>
-        <w:t xml:space="preserve">承包协议项下，联合体作为承包方向润鑫支付承包费、预付款、履约保证金，并向共管账户存入建设资金。润鑫不向联合体或任何成员支付工程款、进度款。对润鑫的付款（承包费、预付款、履约保证金、共管账户1200万元、村补、生态修复专账中应由承包方缴纳的部分）全部由甲方实际支付，乙方不垫付。销售回款进入甲方账户。甲方按本协议第三条向乙方支付施工费用。甲方不得要求乙方按「向发包人结算工程款」的模式配合走账。润鑫或甲方自身融资与本项目建设无关，乙方不为该等融资提供保证、抵押、质押、差额补足或回购，不签署借款合同。</w:t>
+        <w:t xml:space="preserve">承包协议项下，联合体作为承包方向润鑫支付承包费、预付款、履约保证金，并向共管账户存入建设资金。润鑫不向联合体或任何成员支付工程款、进度款。对润鑫的付款（承包费、预付款、履约保证金、共管账户1200万元、村补、生态修复专账中应由承包方缴纳的部分）全部由甲方实际支付，乙方不垫付，也不因承包协议被润鑫要求连带清偿该等金钱债务。销售回款进入甲方账户。甲方按本协议第三条向乙方支付施工费用。甲方不得要求乙方按「向发包人结算工程款」的模式配合走账。润鑫或甲方自身融资与本项目建设无关，乙方不为该等融资提供保证、抵押、质押、差额补足或回购，不签署借款合同。承包协议书第10.12条应订明：金钱给付专属本协议甲方（天木），润鑫无权向本协议乙方（德晟）主张；德晟仅对采掘分工范围承担责任。</w:t>
       </w:r>
     </w:p>
     <w:p>
@@ -12695,7 +12674,7 @@
           <w:sz w:val="24"/>
           <w:szCs w:val="24"/>
         </w:rPr>
-        <w:t xml:space="preserve">《承包协议书》定稿  ｜  第一部分。矿权承包：乙方付费、甲方收费、甲方无工程款义务。已签订《联合体协议书》第四条分工未写入本合同，订入第10.12条，并与第1.3条对齐。第4.2条第（8）项融资为甲方自身需求，与本项目建设无关。</w:t>
+        <w:t xml:space="preserve">《承包协议书》定稿  ｜  第一部分。资金支付义务专属天木，甲方不得向德晟、宏祥主张金钱债权；德晟、宏祥仅对各自职责范围承担责任。第四条分工订入第10.12条。</w:t>
       </w:r>
     </w:p>
     <w:p>

</xml_diff>